<commit_message>
chore: sync latest local state — db, users, requirements doc
- duckdb_analytics.db updated (latest DuckDB state)
- users.json updated (last_login timestamps)
- Sajha_Workspace_Workflows_Panel_ERD.docx updated

Co-Authored-By: Claude Sonnet 4.6 <noreply@anthropic.com>
</commit_message>
<xml_diff>
--- a/requirements/Sajha_Workspace_Workflows_Panel_ERD.docx
+++ b/requirements/Sajha_Workspace_Workflows_Panel_ERD.docx
@@ -50,7 +50,7 @@
           <w:sz w:val="22"/>
           <w:szCs w:val="22"/>
         </w:rPr>
-        <w:t xml:space="preserve">Left-panel drawer · File management · MD-based workflows · Context composition</w:t>
+        <w:t xml:space="preserve">Left-panel drawer · File management · MD-based workflows · Context composition · UX enhancements</w:t>
       </w:r>
     </w:p>
     <w:p>
@@ -5941,6 +5941,1302 @@
           <w:szCs w:val="22"/>
         </w:rPr>
         <w:t xml:space="preserve">When a workflow is sent as part of a prompt, the frontend calls PATCH /api/workflows/{filename}/used to record the current timestamp. This updates the "Last run" display in the Workflows section.</w:t>
+      </w:r>
+    </w:p>
+    <w:p>
+      <w:pPr>
+        <w:spacing w:after="80" w:before="0"/>
+      </w:pPr>
+      <w:r>
+        <w:rPr>
+          <w:rFonts w:ascii="Arial" w:cs="Arial" w:eastAsia="Arial" w:hAnsi="Arial"/>
+          <w:sz w:val="22"/>
+          <w:szCs w:val="22"/>
+        </w:rPr>
+        <w:t xml:space="preserve"/>
+      </w:r>
+    </w:p>
+    <w:p>
+      <w:pPr>
+        <w:pStyle w:val="Heading2"/>
+        <w:pBdr>
+          <w:bottom w:val="single" w:color="2E75B6" w:sz="4" w:space="2"/>
+        </w:pBdr>
+        <w:spacing w:after="100" w:before="200"/>
+      </w:pPr>
+      <w:r>
+        <w:rPr>
+          <w:rFonts w:ascii="Arial" w:cs="Arial" w:eastAsia="Arial" w:hAnsi="Arial"/>
+          <w:b/>
+          <w:bCs/>
+          <w:color w:val="1F3864"/>
+          <w:sz w:val="24"/>
+          <w:szCs w:val="24"/>
+        </w:rPr>
+        <w:t xml:space="preserve">6.4 Runtime Execution Walkthrough</w:t>
+      </w:r>
+    </w:p>
+    <w:p>
+      <w:pPr>
+        <w:spacing w:after="80" w:before="80"/>
+      </w:pPr>
+      <w:r>
+        <w:rPr>
+          <w:rFonts w:ascii="Arial" w:cs="Arial" w:eastAsia="Arial" w:hAnsi="Arial"/>
+          <w:color w:val="1A1A2E"/>
+          <w:sz w:val="22"/>
+          <w:szCs w:val="22"/>
+        </w:rPr>
+        <w:t xml:space="preserve">This section traces a complete end-to-end execution for: user selects "CCR Analysis" workflow + "Q1_exposure.pdf" document, then sends "run CCR analysis on Q1 exposure report".</w:t>
+      </w:r>
+    </w:p>
+    <w:p>
+      <w:pPr>
+        <w:spacing w:after="0" w:before="0"/>
+      </w:pPr>
+      <w:r>
+        <w:rPr>
+          <w:rFonts w:ascii="Arial" w:cs="Arial" w:eastAsia="Arial" w:hAnsi="Arial"/>
+          <w:sz w:val="22"/>
+          <w:szCs w:val="22"/>
+        </w:rPr>
+        <w:t xml:space="preserve"/>
+      </w:r>
+    </w:p>
+    <w:tbl>
+      <w:tblPr>
+        <w:tblW w:type="dxa" w:w="9360"/>
+        <w:tblBorders>
+          <w:top w:val="single" w:color="auto" w:sz="4"/>
+          <w:left w:val="single" w:color="auto" w:sz="4"/>
+          <w:bottom w:val="single" w:color="auto" w:sz="4"/>
+          <w:right w:val="single" w:color="auto" w:sz="4"/>
+          <w:insideH w:val="single" w:color="auto" w:sz="4"/>
+          <w:insideV w:val="single" w:color="auto" w:sz="4"/>
+        </w:tblBorders>
+      </w:tblPr>
+      <w:tblGrid>
+        <w:gridCol w:w="540"/>
+        <w:gridCol w:w="1440"/>
+        <w:gridCol w:w="7380"/>
+      </w:tblGrid>
+      <w:tr>
+        <w:trPr>
+          <w:tblHeader/>
+        </w:trPr>
+        <w:tc>
+          <w:tcPr>
+            <w:tcW w:type="dxa" w:w="540"/>
+            <w:tcBorders>
+              <w:top w:val="single" w:color="CCCCCC" w:sz="1"/>
+              <w:left w:val="single" w:color="CCCCCC" w:sz="1"/>
+              <w:bottom w:val="single" w:color="CCCCCC" w:sz="1"/>
+              <w:right w:val="single" w:color="CCCCCC" w:sz="1"/>
+            </w:tcBorders>
+            <w:shd w:fill="1F3864" w:val="clear"/>
+            <w:tcMar>
+              <w:top w:type="dxa" w:w="80"/>
+              <w:left w:type="dxa" w:w="120"/>
+              <w:bottom w:type="dxa" w:w="80"/>
+              <w:right w:type="dxa" w:w="120"/>
+            </w:tcMar>
+            <w:vAlign w:val="center"/>
+          </w:tcPr>
+          <w:p>
+            <w:r>
+              <w:rPr>
+                <w:rFonts w:ascii="Arial" w:cs="Arial" w:eastAsia="Arial" w:hAnsi="Arial"/>
+                <w:b/>
+                <w:bCs/>
+                <w:color w:val="FFFFFF"/>
+                <w:sz w:val="20"/>
+                <w:szCs w:val="20"/>
+              </w:rPr>
+              <w:t xml:space="preserve">Step</w:t>
+            </w:r>
+          </w:p>
+        </w:tc>
+        <w:tc>
+          <w:tcPr>
+            <w:tcW w:type="dxa" w:w="1440"/>
+            <w:tcBorders>
+              <w:top w:val="single" w:color="CCCCCC" w:sz="1"/>
+              <w:left w:val="single" w:color="CCCCCC" w:sz="1"/>
+              <w:bottom w:val="single" w:color="CCCCCC" w:sz="1"/>
+              <w:right w:val="single" w:color="CCCCCC" w:sz="1"/>
+            </w:tcBorders>
+            <w:shd w:fill="1F3864" w:val="clear"/>
+            <w:tcMar>
+              <w:top w:type="dxa" w:w="80"/>
+              <w:left w:type="dxa" w:w="120"/>
+              <w:bottom w:type="dxa" w:w="80"/>
+              <w:right w:type="dxa" w:w="120"/>
+            </w:tcMar>
+            <w:vAlign w:val="center"/>
+          </w:tcPr>
+          <w:p>
+            <w:r>
+              <w:rPr>
+                <w:rFonts w:ascii="Arial" w:cs="Arial" w:eastAsia="Arial" w:hAnsi="Arial"/>
+                <w:b/>
+                <w:bCs/>
+                <w:color w:val="FFFFFF"/>
+                <w:sz w:val="20"/>
+                <w:szCs w:val="20"/>
+              </w:rPr>
+              <w:t xml:space="preserve">Who</w:t>
+            </w:r>
+          </w:p>
+        </w:tc>
+        <w:tc>
+          <w:tcPr>
+            <w:tcW w:type="dxa" w:w="7380"/>
+            <w:tcBorders>
+              <w:top w:val="single" w:color="CCCCCC" w:sz="1"/>
+              <w:left w:val="single" w:color="CCCCCC" w:sz="1"/>
+              <w:bottom w:val="single" w:color="CCCCCC" w:sz="1"/>
+              <w:right w:val="single" w:color="CCCCCC" w:sz="1"/>
+            </w:tcBorders>
+            <w:shd w:fill="1F3864" w:val="clear"/>
+            <w:tcMar>
+              <w:top w:type="dxa" w:w="80"/>
+              <w:left w:type="dxa" w:w="120"/>
+              <w:bottom w:type="dxa" w:w="80"/>
+              <w:right w:type="dxa" w:w="120"/>
+            </w:tcMar>
+            <w:vAlign w:val="center"/>
+          </w:tcPr>
+          <w:p>
+            <w:r>
+              <w:rPr>
+                <w:rFonts w:ascii="Arial" w:cs="Arial" w:eastAsia="Arial" w:hAnsi="Arial"/>
+                <w:b/>
+                <w:bCs/>
+                <w:color w:val="FFFFFF"/>
+                <w:sz w:val="20"/>
+                <w:szCs w:val="20"/>
+              </w:rPr>
+              <w:t xml:space="preserve">What happens</w:t>
+            </w:r>
+          </w:p>
+        </w:tc>
+      </w:tr>
+      <w:tr>
+        <w:tc>
+          <w:tcPr>
+            <w:tcW w:type="dxa" w:w="540"/>
+            <w:tcBorders>
+              <w:top w:val="single" w:color="CCCCCC" w:sz="1"/>
+              <w:left w:val="single" w:color="CCCCCC" w:sz="1"/>
+              <w:bottom w:val="single" w:color="CCCCCC" w:sz="1"/>
+              <w:right w:val="single" w:color="CCCCCC" w:sz="1"/>
+            </w:tcBorders>
+            <w:shd w:fill="FFFFFF" w:val="clear"/>
+            <w:tcMar>
+              <w:top w:type="dxa" w:w="80"/>
+              <w:left w:type="dxa" w:w="120"/>
+              <w:bottom w:type="dxa" w:w="80"/>
+              <w:right w:type="dxa" w:w="120"/>
+            </w:tcMar>
+            <w:vAlign w:val="top"/>
+          </w:tcPr>
+          <w:p>
+            <w:pPr>
+              <w:spacing w:after="40" w:before="40"/>
+            </w:pPr>
+            <w:r>
+              <w:rPr>
+                <w:rFonts w:ascii="Arial" w:cs="Arial" w:eastAsia="Arial" w:hAnsi="Arial"/>
+                <w:b w:val="false"/>
+                <w:bCs w:val="false"/>
+                <w:color w:val="1A1A2E"/>
+                <w:sz w:val="20"/>
+                <w:szCs w:val="20"/>
+              </w:rPr>
+              <w:t xml:space="preserve">1  Select context</w:t>
+            </w:r>
+          </w:p>
+        </w:tc>
+        <w:tc>
+          <w:tcPr>
+            <w:tcW w:type="dxa" w:w="1440"/>
+            <w:tcBorders>
+              <w:top w:val="single" w:color="CCCCCC" w:sz="1"/>
+              <w:left w:val="single" w:color="CCCCCC" w:sz="1"/>
+              <w:bottom w:val="single" w:color="CCCCCC" w:sz="1"/>
+              <w:right w:val="single" w:color="CCCCCC" w:sz="1"/>
+            </w:tcBorders>
+            <w:shd w:fill="FFFFFF" w:val="clear"/>
+            <w:tcMar>
+              <w:top w:type="dxa" w:w="80"/>
+              <w:left w:type="dxa" w:w="120"/>
+              <w:bottom w:type="dxa" w:w="80"/>
+              <w:right w:type="dxa" w:w="120"/>
+            </w:tcMar>
+            <w:vAlign w:val="top"/>
+          </w:tcPr>
+          <w:p>
+            <w:pPr>
+              <w:spacing w:after="40" w:before="40"/>
+            </w:pPr>
+            <w:r>
+              <w:rPr>
+                <w:rFonts w:ascii="Arial" w:cs="Arial" w:eastAsia="Arial" w:hAnsi="Arial"/>
+                <w:b w:val="false"/>
+                <w:bCs w:val="false"/>
+                <w:color w:val="1A1A2E"/>
+                <w:sz w:val="20"/>
+                <w:szCs w:val="20"/>
+              </w:rPr>
+              <w:t xml:space="preserve">User</w:t>
+            </w:r>
+          </w:p>
+        </w:tc>
+        <w:tc>
+          <w:tcPr>
+            <w:tcW w:type="dxa" w:w="7380"/>
+            <w:tcBorders>
+              <w:top w:val="single" w:color="CCCCCC" w:sz="1"/>
+              <w:left w:val="single" w:color="CCCCCC" w:sz="1"/>
+              <w:bottom w:val="single" w:color="CCCCCC" w:sz="1"/>
+              <w:right w:val="single" w:color="CCCCCC" w:sz="1"/>
+            </w:tcBorders>
+            <w:shd w:fill="FFFFFF" w:val="clear"/>
+            <w:tcMar>
+              <w:top w:type="dxa" w:w="80"/>
+              <w:left w:type="dxa" w:w="120"/>
+              <w:bottom w:type="dxa" w:w="80"/>
+              <w:right w:type="dxa" w:w="120"/>
+            </w:tcMar>
+            <w:vAlign w:val="top"/>
+          </w:tcPr>
+          <w:p>
+            <w:pPr>
+              <w:spacing w:after="40" w:before="40"/>
+            </w:pPr>
+            <w:r>
+              <w:rPr>
+                <w:rFonts w:ascii="Arial" w:cs="Arial" w:eastAsia="Arial" w:hAnsi="Arial"/>
+                <w:b w:val="false"/>
+                <w:bCs w:val="false"/>
+                <w:color w:val="1A1A2E"/>
+                <w:sz w:val="20"/>
+                <w:szCs w:val="20"/>
+              </w:rPr>
+              <w:t xml:space="preserve">Clicks "CCR Analysis" in the Workflows section (purple tag appears in context bar). Clicks "Q1_exposure.pdf" in My Workspace (blue tag appears). Nothing sent yet — these are staged selections only.</w:t>
+            </w:r>
+          </w:p>
+        </w:tc>
+      </w:tr>
+      <w:tr>
+        <w:tc>
+          <w:tcPr>
+            <w:tcW w:type="dxa" w:w="540"/>
+            <w:tcBorders>
+              <w:top w:val="single" w:color="CCCCCC" w:sz="1"/>
+              <w:left w:val="single" w:color="CCCCCC" w:sz="1"/>
+              <w:bottom w:val="single" w:color="CCCCCC" w:sz="1"/>
+              <w:right w:val="single" w:color="CCCCCC" w:sz="1"/>
+            </w:tcBorders>
+            <w:shd w:fill="F2F7FC" w:val="clear"/>
+            <w:tcMar>
+              <w:top w:type="dxa" w:w="80"/>
+              <w:left w:type="dxa" w:w="120"/>
+              <w:bottom w:type="dxa" w:w="80"/>
+              <w:right w:type="dxa" w:w="120"/>
+            </w:tcMar>
+            <w:vAlign w:val="top"/>
+          </w:tcPr>
+          <w:p>
+            <w:pPr>
+              <w:spacing w:after="40" w:before="40"/>
+            </w:pPr>
+            <w:r>
+              <w:rPr>
+                <w:rFonts w:ascii="Arial" w:cs="Arial" w:eastAsia="Arial" w:hAnsi="Arial"/>
+                <w:b w:val="false"/>
+                <w:bCs w:val="false"/>
+                <w:color w:val="1A1A2E"/>
+                <w:sz w:val="20"/>
+                <w:szCs w:val="20"/>
+              </w:rPr>
+              <w:t xml:space="preserve">2  Type message</w:t>
+            </w:r>
+          </w:p>
+        </w:tc>
+        <w:tc>
+          <w:tcPr>
+            <w:tcW w:type="dxa" w:w="1440"/>
+            <w:tcBorders>
+              <w:top w:val="single" w:color="CCCCCC" w:sz="1"/>
+              <w:left w:val="single" w:color="CCCCCC" w:sz="1"/>
+              <w:bottom w:val="single" w:color="CCCCCC" w:sz="1"/>
+              <w:right w:val="single" w:color="CCCCCC" w:sz="1"/>
+            </w:tcBorders>
+            <w:shd w:fill="F2F7FC" w:val="clear"/>
+            <w:tcMar>
+              <w:top w:type="dxa" w:w="80"/>
+              <w:left w:type="dxa" w:w="120"/>
+              <w:bottom w:type="dxa" w:w="80"/>
+              <w:right w:type="dxa" w:w="120"/>
+            </w:tcMar>
+            <w:vAlign w:val="top"/>
+          </w:tcPr>
+          <w:p>
+            <w:pPr>
+              <w:spacing w:after="40" w:before="40"/>
+            </w:pPr>
+            <w:r>
+              <w:rPr>
+                <w:rFonts w:ascii="Arial" w:cs="Arial" w:eastAsia="Arial" w:hAnsi="Arial"/>
+                <w:b w:val="false"/>
+                <w:bCs w:val="false"/>
+                <w:color w:val="1A1A2E"/>
+                <w:sz w:val="20"/>
+                <w:szCs w:val="20"/>
+              </w:rPr>
+              <w:t xml:space="preserve">User</w:t>
+            </w:r>
+          </w:p>
+        </w:tc>
+        <w:tc>
+          <w:tcPr>
+            <w:tcW w:type="dxa" w:w="7380"/>
+            <w:tcBorders>
+              <w:top w:val="single" w:color="CCCCCC" w:sz="1"/>
+              <w:left w:val="single" w:color="CCCCCC" w:sz="1"/>
+              <w:bottom w:val="single" w:color="CCCCCC" w:sz="1"/>
+              <w:right w:val="single" w:color="CCCCCC" w:sz="1"/>
+            </w:tcBorders>
+            <w:shd w:fill="F2F7FC" w:val="clear"/>
+            <w:tcMar>
+              <w:top w:type="dxa" w:w="80"/>
+              <w:left w:type="dxa" w:w="120"/>
+              <w:bottom w:type="dxa" w:w="80"/>
+              <w:right w:type="dxa" w:w="120"/>
+            </w:tcMar>
+            <w:vAlign w:val="top"/>
+          </w:tcPr>
+          <w:p>
+            <w:pPr>
+              <w:spacing w:after="40" w:before="40"/>
+            </w:pPr>
+            <w:r>
+              <w:rPr>
+                <w:rFonts w:ascii="Arial" w:cs="Arial" w:eastAsia="Arial" w:hAnsi="Arial"/>
+                <w:b w:val="false"/>
+                <w:bCs w:val="false"/>
+                <w:color w:val="1A1A2E"/>
+                <w:sz w:val="20"/>
+                <w:szCs w:val="20"/>
+              </w:rPr>
+              <w:t xml:space="preserve">Types "run CCR analysis on Q1 exposure report" in chat input and presses Send.</w:t>
+            </w:r>
+          </w:p>
+        </w:tc>
+      </w:tr>
+      <w:tr>
+        <w:tc>
+          <w:tcPr>
+            <w:tcW w:type="dxa" w:w="540"/>
+            <w:tcBorders>
+              <w:top w:val="single" w:color="CCCCCC" w:sz="1"/>
+              <w:left w:val="single" w:color="CCCCCC" w:sz="1"/>
+              <w:bottom w:val="single" w:color="CCCCCC" w:sz="1"/>
+              <w:right w:val="single" w:color="CCCCCC" w:sz="1"/>
+            </w:tcBorders>
+            <w:shd w:fill="FFFFFF" w:val="clear"/>
+            <w:tcMar>
+              <w:top w:type="dxa" w:w="80"/>
+              <w:left w:type="dxa" w:w="120"/>
+              <w:bottom w:type="dxa" w:w="80"/>
+              <w:right w:type="dxa" w:w="120"/>
+            </w:tcMar>
+            <w:vAlign w:val="top"/>
+          </w:tcPr>
+          <w:p>
+            <w:pPr>
+              <w:spacing w:after="40" w:before="40"/>
+            </w:pPr>
+            <w:r>
+              <w:rPr>
+                <w:rFonts w:ascii="Arial" w:cs="Arial" w:eastAsia="Arial" w:hAnsi="Arial"/>
+                <w:b w:val="false"/>
+                <w:bCs w:val="false"/>
+                <w:color w:val="1A1A2E"/>
+                <w:sz w:val="20"/>
+                <w:szCs w:val="20"/>
+              </w:rPr>
+              <w:t xml:space="preserve">3  composeMessage()</w:t>
+            </w:r>
+          </w:p>
+        </w:tc>
+        <w:tc>
+          <w:tcPr>
+            <w:tcW w:type="dxa" w:w="1440"/>
+            <w:tcBorders>
+              <w:top w:val="single" w:color="CCCCCC" w:sz="1"/>
+              <w:left w:val="single" w:color="CCCCCC" w:sz="1"/>
+              <w:bottom w:val="single" w:color="CCCCCC" w:sz="1"/>
+              <w:right w:val="single" w:color="CCCCCC" w:sz="1"/>
+            </w:tcBorders>
+            <w:shd w:fill="FFFFFF" w:val="clear"/>
+            <w:tcMar>
+              <w:top w:type="dxa" w:w="80"/>
+              <w:left w:type="dxa" w:w="120"/>
+              <w:bottom w:type="dxa" w:w="80"/>
+              <w:right w:type="dxa" w:w="120"/>
+            </w:tcMar>
+            <w:vAlign w:val="top"/>
+          </w:tcPr>
+          <w:p>
+            <w:pPr>
+              <w:spacing w:after="40" w:before="40"/>
+            </w:pPr>
+            <w:r>
+              <w:rPr>
+                <w:rFonts w:ascii="Arial" w:cs="Arial" w:eastAsia="Arial" w:hAnsi="Arial"/>
+                <w:b w:val="false"/>
+                <w:bCs w:val="false"/>
+                <w:color w:val="1A1A2E"/>
+                <w:sz w:val="20"/>
+                <w:szCs w:val="20"/>
+              </w:rPr>
+              <w:t xml:space="preserve">Frontend</w:t>
+            </w:r>
+          </w:p>
+        </w:tc>
+        <w:tc>
+          <w:tcPr>
+            <w:tcW w:type="dxa" w:w="7380"/>
+            <w:tcBorders>
+              <w:top w:val="single" w:color="CCCCCC" w:sz="1"/>
+              <w:left w:val="single" w:color="CCCCCC" w:sz="1"/>
+              <w:bottom w:val="single" w:color="CCCCCC" w:sz="1"/>
+              <w:right w:val="single" w:color="CCCCCC" w:sz="1"/>
+            </w:tcBorders>
+            <w:shd w:fill="FFFFFF" w:val="clear"/>
+            <w:tcMar>
+              <w:top w:type="dxa" w:w="80"/>
+              <w:left w:type="dxa" w:w="120"/>
+              <w:bottom w:type="dxa" w:w="80"/>
+              <w:right w:type="dxa" w:w="120"/>
+            </w:tcMar>
+            <w:vAlign w:val="top"/>
+          </w:tcPr>
+          <w:p>
+            <w:pPr>
+              <w:spacing w:after="40" w:before="40"/>
+            </w:pPr>
+            <w:r>
+              <w:rPr>
+                <w:rFonts w:ascii="Arial" w:cs="Arial" w:eastAsia="Arial" w:hAnsi="Arial"/>
+                <w:b w:val="false"/>
+                <w:bCs w:val="false"/>
+                <w:color w:val="1A1A2E"/>
+                <w:sz w:val="20"/>
+                <w:szCs w:val="20"/>
+              </w:rPr>
+              <w:t xml:space="preserve">Before the request leaves the browser, composeMessage() is called. It GETs /api/workflows/counterparty_intelligence.md to fetch the full MD content, then assembles the payload:
+[Workflow: CCR Analysis]
+## Step 1: Search counterparty...
+## Step 2: Pull dashboard...
+...all 10 steps...
+[Context Documents: Q1_exposure.pdf]
+---
+run CCR analysis on Q1 exposure report</w:t>
+            </w:r>
+          </w:p>
+        </w:tc>
+      </w:tr>
+      <w:tr>
+        <w:tc>
+          <w:tcPr>
+            <w:tcW w:type="dxa" w:w="540"/>
+            <w:tcBorders>
+              <w:top w:val="single" w:color="CCCCCC" w:sz="1"/>
+              <w:left w:val="single" w:color="CCCCCC" w:sz="1"/>
+              <w:bottom w:val="single" w:color="CCCCCC" w:sz="1"/>
+              <w:right w:val="single" w:color="CCCCCC" w:sz="1"/>
+            </w:tcBorders>
+            <w:shd w:fill="F2F7FC" w:val="clear"/>
+            <w:tcMar>
+              <w:top w:type="dxa" w:w="80"/>
+              <w:left w:type="dxa" w:w="120"/>
+              <w:bottom w:type="dxa" w:w="80"/>
+              <w:right w:type="dxa" w:w="120"/>
+            </w:tcMar>
+            <w:vAlign w:val="top"/>
+          </w:tcPr>
+          <w:p>
+            <w:pPr>
+              <w:spacing w:after="40" w:before="40"/>
+            </w:pPr>
+            <w:r>
+              <w:rPr>
+                <w:rFonts w:ascii="Arial" w:cs="Arial" w:eastAsia="Arial" w:hAnsi="Arial"/>
+                <w:b w:val="false"/>
+                <w:bCs w:val="false"/>
+                <w:color w:val="1A1A2E"/>
+                <w:sz w:val="20"/>
+                <w:szCs w:val="20"/>
+              </w:rPr>
+              <w:t xml:space="preserve">4  POST to agent</w:t>
+            </w:r>
+          </w:p>
+        </w:tc>
+        <w:tc>
+          <w:tcPr>
+            <w:tcW w:type="dxa" w:w="1440"/>
+            <w:tcBorders>
+              <w:top w:val="single" w:color="CCCCCC" w:sz="1"/>
+              <w:left w:val="single" w:color="CCCCCC" w:sz="1"/>
+              <w:bottom w:val="single" w:color="CCCCCC" w:sz="1"/>
+              <w:right w:val="single" w:color="CCCCCC" w:sz="1"/>
+            </w:tcBorders>
+            <w:shd w:fill="F2F7FC" w:val="clear"/>
+            <w:tcMar>
+              <w:top w:type="dxa" w:w="80"/>
+              <w:left w:type="dxa" w:w="120"/>
+              <w:bottom w:type="dxa" w:w="80"/>
+              <w:right w:type="dxa" w:w="120"/>
+            </w:tcMar>
+            <w:vAlign w:val="top"/>
+          </w:tcPr>
+          <w:p>
+            <w:pPr>
+              <w:spacing w:after="40" w:before="40"/>
+            </w:pPr>
+            <w:r>
+              <w:rPr>
+                <w:rFonts w:ascii="Arial" w:cs="Arial" w:eastAsia="Arial" w:hAnsi="Arial"/>
+                <w:b w:val="false"/>
+                <w:bCs w:val="false"/>
+                <w:color w:val="1A1A2E"/>
+                <w:sz w:val="20"/>
+                <w:szCs w:val="20"/>
+              </w:rPr>
+              <w:t xml:space="preserve">Frontend</w:t>
+            </w:r>
+          </w:p>
+        </w:tc>
+        <w:tc>
+          <w:tcPr>
+            <w:tcW w:type="dxa" w:w="7380"/>
+            <w:tcBorders>
+              <w:top w:val="single" w:color="CCCCCC" w:sz="1"/>
+              <w:left w:val="single" w:color="CCCCCC" w:sz="1"/>
+              <w:bottom w:val="single" w:color="CCCCCC" w:sz="1"/>
+              <w:right w:val="single" w:color="CCCCCC" w:sz="1"/>
+            </w:tcBorders>
+            <w:shd w:fill="F2F7FC" w:val="clear"/>
+            <w:tcMar>
+              <w:top w:type="dxa" w:w="80"/>
+              <w:left w:type="dxa" w:w="120"/>
+              <w:bottom w:type="dxa" w:w="80"/>
+              <w:right w:type="dxa" w:w="120"/>
+            </w:tcMar>
+            <w:vAlign w:val="top"/>
+          </w:tcPr>
+          <w:p>
+            <w:pPr>
+              <w:spacing w:after="40" w:before="40"/>
+            </w:pPr>
+            <w:r>
+              <w:rPr>
+                <w:rFonts w:ascii="Arial" w:cs="Arial" w:eastAsia="Arial" w:hAnsi="Arial"/>
+                <w:b w:val="false"/>
+                <w:bCs w:val="false"/>
+                <w:color w:val="1A1A2E"/>
+                <w:sz w:val="20"/>
+                <w:szCs w:val="20"/>
+              </w:rPr>
+              <w:t xml:space="preserve">The composed string is sent as the user message to POST /api/agent/run. No special workflow flag — it is a normal message with rich instructions prepended.</w:t>
+            </w:r>
+          </w:p>
+        </w:tc>
+      </w:tr>
+      <w:tr>
+        <w:tc>
+          <w:tcPr>
+            <w:tcW w:type="dxa" w:w="540"/>
+            <w:tcBorders>
+              <w:top w:val="single" w:color="CCCCCC" w:sz="1"/>
+              <w:left w:val="single" w:color="CCCCCC" w:sz="1"/>
+              <w:bottom w:val="single" w:color="CCCCCC" w:sz="1"/>
+              <w:right w:val="single" w:color="CCCCCC" w:sz="1"/>
+            </w:tcBorders>
+            <w:shd w:fill="FFFFFF" w:val="clear"/>
+            <w:tcMar>
+              <w:top w:type="dxa" w:w="80"/>
+              <w:left w:type="dxa" w:w="120"/>
+              <w:bottom w:type="dxa" w:w="80"/>
+              <w:right w:type="dxa" w:w="120"/>
+            </w:tcMar>
+            <w:vAlign w:val="top"/>
+          </w:tcPr>
+          <w:p>
+            <w:pPr>
+              <w:spacing w:after="40" w:before="40"/>
+            </w:pPr>
+            <w:r>
+              <w:rPr>
+                <w:rFonts w:ascii="Arial" w:cs="Arial" w:eastAsia="Arial" w:hAnsi="Arial"/>
+                <w:b w:val="false"/>
+                <w:bCs w:val="false"/>
+                <w:color w:val="1A1A2E"/>
+                <w:sz w:val="20"/>
+                <w:szCs w:val="20"/>
+              </w:rPr>
+              <w:t xml:space="preserve">5  LLM receives prompt</w:t>
+            </w:r>
+          </w:p>
+        </w:tc>
+        <w:tc>
+          <w:tcPr>
+            <w:tcW w:type="dxa" w:w="1440"/>
+            <w:tcBorders>
+              <w:top w:val="single" w:color="CCCCCC" w:sz="1"/>
+              <w:left w:val="single" w:color="CCCCCC" w:sz="1"/>
+              <w:bottom w:val="single" w:color="CCCCCC" w:sz="1"/>
+              <w:right w:val="single" w:color="CCCCCC" w:sz="1"/>
+            </w:tcBorders>
+            <w:shd w:fill="FFFFFF" w:val="clear"/>
+            <w:tcMar>
+              <w:top w:type="dxa" w:w="80"/>
+              <w:left w:type="dxa" w:w="120"/>
+              <w:bottom w:type="dxa" w:w="80"/>
+              <w:right w:type="dxa" w:w="120"/>
+            </w:tcMar>
+            <w:vAlign w:val="top"/>
+          </w:tcPr>
+          <w:p>
+            <w:pPr>
+              <w:spacing w:after="40" w:before="40"/>
+            </w:pPr>
+            <w:r>
+              <w:rPr>
+                <w:rFonts w:ascii="Arial" w:cs="Arial" w:eastAsia="Arial" w:hAnsi="Arial"/>
+                <w:b w:val="false"/>
+                <w:bCs w:val="false"/>
+                <w:color w:val="1A1A2E"/>
+                <w:sz w:val="20"/>
+                <w:szCs w:val="20"/>
+              </w:rPr>
+              <w:t xml:space="preserve">Agent (LLM)</w:t>
+            </w:r>
+          </w:p>
+        </w:tc>
+        <w:tc>
+          <w:tcPr>
+            <w:tcW w:type="dxa" w:w="7380"/>
+            <w:tcBorders>
+              <w:top w:val="single" w:color="CCCCCC" w:sz="1"/>
+              <w:left w:val="single" w:color="CCCCCC" w:sz="1"/>
+              <w:bottom w:val="single" w:color="CCCCCC" w:sz="1"/>
+              <w:right w:val="single" w:color="CCCCCC" w:sz="1"/>
+            </w:tcBorders>
+            <w:shd w:fill="FFFFFF" w:val="clear"/>
+            <w:tcMar>
+              <w:top w:type="dxa" w:w="80"/>
+              <w:left w:type="dxa" w:w="120"/>
+              <w:bottom w:type="dxa" w:w="80"/>
+              <w:right w:type="dxa" w:w="120"/>
+            </w:tcMar>
+            <w:vAlign w:val="top"/>
+          </w:tcPr>
+          <w:p>
+            <w:pPr>
+              <w:spacing w:after="40" w:before="40"/>
+            </w:pPr>
+            <w:r>
+              <w:rPr>
+                <w:rFonts w:ascii="Arial" w:cs="Arial" w:eastAsia="Arial" w:hAnsi="Arial"/>
+                <w:b w:val="false"/>
+                <w:bCs w:val="false"/>
+                <w:color w:val="1A1A2E"/>
+                <w:sz w:val="20"/>
+                <w:szCs w:val="20"/>
+              </w:rPr>
+              <w:t xml:space="preserve">The LLM reads the full composed message. The [Workflow: ...] header + MD content tells it "these are your instructions." The [Context Documents: ...] line tells it which file to reference. The user message gives the specific subject.</w:t>
+            </w:r>
+          </w:p>
+        </w:tc>
+      </w:tr>
+      <w:tr>
+        <w:tc>
+          <w:tcPr>
+            <w:tcW w:type="dxa" w:w="540"/>
+            <w:tcBorders>
+              <w:top w:val="single" w:color="CCCCCC" w:sz="1"/>
+              <w:left w:val="single" w:color="CCCCCC" w:sz="1"/>
+              <w:bottom w:val="single" w:color="CCCCCC" w:sz="1"/>
+              <w:right w:val="single" w:color="CCCCCC" w:sz="1"/>
+            </w:tcBorders>
+            <w:shd w:fill="F2F7FC" w:val="clear"/>
+            <w:tcMar>
+              <w:top w:type="dxa" w:w="80"/>
+              <w:left w:type="dxa" w:w="120"/>
+              <w:bottom w:type="dxa" w:w="80"/>
+              <w:right w:type="dxa" w:w="120"/>
+            </w:tcMar>
+            <w:vAlign w:val="top"/>
+          </w:tcPr>
+          <w:p>
+            <w:pPr>
+              <w:spacing w:after="40" w:before="40"/>
+            </w:pPr>
+            <w:r>
+              <w:rPr>
+                <w:rFonts w:ascii="Arial" w:cs="Arial" w:eastAsia="Arial" w:hAnsi="Arial"/>
+                <w:b w:val="false"/>
+                <w:bCs w:val="false"/>
+                <w:color w:val="1A1A2E"/>
+                <w:sz w:val="20"/>
+                <w:szCs w:val="20"/>
+              </w:rPr>
+              <w:t xml:space="preserve">6  Sequential execution</w:t>
+            </w:r>
+          </w:p>
+        </w:tc>
+        <w:tc>
+          <w:tcPr>
+            <w:tcW w:type="dxa" w:w="1440"/>
+            <w:tcBorders>
+              <w:top w:val="single" w:color="CCCCCC" w:sz="1"/>
+              <w:left w:val="single" w:color="CCCCCC" w:sz="1"/>
+              <w:bottom w:val="single" w:color="CCCCCC" w:sz="1"/>
+              <w:right w:val="single" w:color="CCCCCC" w:sz="1"/>
+            </w:tcBorders>
+            <w:shd w:fill="F2F7FC" w:val="clear"/>
+            <w:tcMar>
+              <w:top w:type="dxa" w:w="80"/>
+              <w:left w:type="dxa" w:w="120"/>
+              <w:bottom w:type="dxa" w:w="80"/>
+              <w:right w:type="dxa" w:w="120"/>
+            </w:tcMar>
+            <w:vAlign w:val="top"/>
+          </w:tcPr>
+          <w:p>
+            <w:pPr>
+              <w:spacing w:after="40" w:before="40"/>
+            </w:pPr>
+            <w:r>
+              <w:rPr>
+                <w:rFonts w:ascii="Arial" w:cs="Arial" w:eastAsia="Arial" w:hAnsi="Arial"/>
+                <w:b w:val="false"/>
+                <w:bCs w:val="false"/>
+                <w:color w:val="1A1A2E"/>
+                <w:sz w:val="20"/>
+                <w:szCs w:val="20"/>
+              </w:rPr>
+              <w:t xml:space="preserve">Agent (LLM)</w:t>
+            </w:r>
+          </w:p>
+        </w:tc>
+        <w:tc>
+          <w:tcPr>
+            <w:tcW w:type="dxa" w:w="7380"/>
+            <w:tcBorders>
+              <w:top w:val="single" w:color="CCCCCC" w:sz="1"/>
+              <w:left w:val="single" w:color="CCCCCC" w:sz="1"/>
+              <w:bottom w:val="single" w:color="CCCCCC" w:sz="1"/>
+              <w:right w:val="single" w:color="CCCCCC" w:sz="1"/>
+            </w:tcBorders>
+            <w:shd w:fill="F2F7FC" w:val="clear"/>
+            <w:tcMar>
+              <w:top w:type="dxa" w:w="80"/>
+              <w:left w:type="dxa" w:w="120"/>
+              <w:bottom w:type="dxa" w:w="80"/>
+              <w:right w:type="dxa" w:w="120"/>
+            </w:tcMar>
+            <w:vAlign w:val="top"/>
+          </w:tcPr>
+          <w:p>
+            <w:pPr>
+              <w:spacing w:after="40" w:before="40"/>
+            </w:pPr>
+            <w:r>
+              <w:rPr>
+                <w:rFonts w:ascii="Arial" w:cs="Arial" w:eastAsia="Arial" w:hAnsi="Arial"/>
+                <w:b w:val="false"/>
+                <w:bCs w:val="false"/>
+                <w:color w:val="1A1A2E"/>
+                <w:sz w:val="20"/>
+                <w:szCs w:val="20"/>
+              </w:rPr>
+              <w:t xml:space="preserve">The LLM is the workflow engine. It reads Step 1, calls the relevant MCP tool (e.g. iris_search_counterparties), gets a result, then moves to Step 2. Each step's tool result is in context when Step N+1 runs. No explicit piping — the context window holds intermediate results naturally.</w:t>
+            </w:r>
+          </w:p>
+        </w:tc>
+      </w:tr>
+      <w:tr>
+        <w:tc>
+          <w:tcPr>
+            <w:tcW w:type="dxa" w:w="540"/>
+            <w:tcBorders>
+              <w:top w:val="single" w:color="CCCCCC" w:sz="1"/>
+              <w:left w:val="single" w:color="CCCCCC" w:sz="1"/>
+              <w:bottom w:val="single" w:color="CCCCCC" w:sz="1"/>
+              <w:right w:val="single" w:color="CCCCCC" w:sz="1"/>
+            </w:tcBorders>
+            <w:shd w:fill="FFFFFF" w:val="clear"/>
+            <w:tcMar>
+              <w:top w:type="dxa" w:w="80"/>
+              <w:left w:type="dxa" w:w="120"/>
+              <w:bottom w:type="dxa" w:w="80"/>
+              <w:right w:type="dxa" w:w="120"/>
+            </w:tcMar>
+            <w:vAlign w:val="top"/>
+          </w:tcPr>
+          <w:p>
+            <w:pPr>
+              <w:spacing w:after="40" w:before="40"/>
+            </w:pPr>
+            <w:r>
+              <w:rPr>
+                <w:rFonts w:ascii="Arial" w:cs="Arial" w:eastAsia="Arial" w:hAnsi="Arial"/>
+                <w:b w:val="false"/>
+                <w:bCs w:val="false"/>
+                <w:color w:val="1A1A2E"/>
+                <w:sz w:val="20"/>
+                <w:szCs w:val="20"/>
+              </w:rPr>
+              <w:t xml:space="preserve">7  Document reference</w:t>
+            </w:r>
+          </w:p>
+        </w:tc>
+        <w:tc>
+          <w:tcPr>
+            <w:tcW w:type="dxa" w:w="1440"/>
+            <w:tcBorders>
+              <w:top w:val="single" w:color="CCCCCC" w:sz="1"/>
+              <w:left w:val="single" w:color="CCCCCC" w:sz="1"/>
+              <w:bottom w:val="single" w:color="CCCCCC" w:sz="1"/>
+              <w:right w:val="single" w:color="CCCCCC" w:sz="1"/>
+            </w:tcBorders>
+            <w:shd w:fill="FFFFFF" w:val="clear"/>
+            <w:tcMar>
+              <w:top w:type="dxa" w:w="80"/>
+              <w:left w:type="dxa" w:w="120"/>
+              <w:bottom w:type="dxa" w:w="80"/>
+              <w:right w:type="dxa" w:w="120"/>
+            </w:tcMar>
+            <w:vAlign w:val="top"/>
+          </w:tcPr>
+          <w:p>
+            <w:pPr>
+              <w:spacing w:after="40" w:before="40"/>
+            </w:pPr>
+            <w:r>
+              <w:rPr>
+                <w:rFonts w:ascii="Arial" w:cs="Arial" w:eastAsia="Arial" w:hAnsi="Arial"/>
+                <w:b w:val="false"/>
+                <w:bCs w:val="false"/>
+                <w:color w:val="1A1A2E"/>
+                <w:sz w:val="20"/>
+                <w:szCs w:val="20"/>
+              </w:rPr>
+              <w:t xml:space="preserve">Agent (LLM)</w:t>
+            </w:r>
+          </w:p>
+        </w:tc>
+        <w:tc>
+          <w:tcPr>
+            <w:tcW w:type="dxa" w:w="7380"/>
+            <w:tcBorders>
+              <w:top w:val="single" w:color="CCCCCC" w:sz="1"/>
+              <w:left w:val="single" w:color="CCCCCC" w:sz="1"/>
+              <w:bottom w:val="single" w:color="CCCCCC" w:sz="1"/>
+              <w:right w:val="single" w:color="CCCCCC" w:sz="1"/>
+            </w:tcBorders>
+            <w:shd w:fill="FFFFFF" w:val="clear"/>
+            <w:tcMar>
+              <w:top w:type="dxa" w:w="80"/>
+              <w:left w:type="dxa" w:w="120"/>
+              <w:bottom w:type="dxa" w:w="80"/>
+              <w:right w:type="dxa" w:w="120"/>
+            </w:tcMar>
+            <w:vAlign w:val="top"/>
+          </w:tcPr>
+          <w:p>
+            <w:pPr>
+              <w:spacing w:after="40" w:before="40"/>
+            </w:pPr>
+            <w:r>
+              <w:rPr>
+                <w:rFonts w:ascii="Arial" w:cs="Arial" w:eastAsia="Arial" w:hAnsi="Arial"/>
+                <w:b w:val="false"/>
+                <w:bCs w:val="false"/>
+                <w:color w:val="1A1A2E"/>
+                <w:sz w:val="20"/>
+                <w:szCs w:val="20"/>
+              </w:rPr>
+              <w:t xml:space="preserve">Where a step says "using the input document", the LLM calls list_uploaded_files, identifies Q1_exposure.pdf by name, and references it in the relevant tool call or extraction step.</w:t>
+            </w:r>
+          </w:p>
+        </w:tc>
+      </w:tr>
+      <w:tr>
+        <w:tc>
+          <w:tcPr>
+            <w:tcW w:type="dxa" w:w="540"/>
+            <w:tcBorders>
+              <w:top w:val="single" w:color="CCCCCC" w:sz="1"/>
+              <w:left w:val="single" w:color="CCCCCC" w:sz="1"/>
+              <w:bottom w:val="single" w:color="CCCCCC" w:sz="1"/>
+              <w:right w:val="single" w:color="CCCCCC" w:sz="1"/>
+            </w:tcBorders>
+            <w:shd w:fill="F2F7FC" w:val="clear"/>
+            <w:tcMar>
+              <w:top w:type="dxa" w:w="80"/>
+              <w:left w:type="dxa" w:w="120"/>
+              <w:bottom w:type="dxa" w:w="80"/>
+              <w:right w:type="dxa" w:w="120"/>
+            </w:tcMar>
+            <w:vAlign w:val="top"/>
+          </w:tcPr>
+          <w:p>
+            <w:pPr>
+              <w:spacing w:after="40" w:before="40"/>
+            </w:pPr>
+            <w:r>
+              <w:rPr>
+                <w:rFonts w:ascii="Arial" w:cs="Arial" w:eastAsia="Arial" w:hAnsi="Arial"/>
+                <w:b w:val="false"/>
+                <w:bCs w:val="false"/>
+                <w:color w:val="1A1A2E"/>
+                <w:sz w:val="20"/>
+                <w:szCs w:val="20"/>
+              </w:rPr>
+              <w:t xml:space="preserve">8  Final synthesis</w:t>
+            </w:r>
+          </w:p>
+        </w:tc>
+        <w:tc>
+          <w:tcPr>
+            <w:tcW w:type="dxa" w:w="1440"/>
+            <w:tcBorders>
+              <w:top w:val="single" w:color="CCCCCC" w:sz="1"/>
+              <w:left w:val="single" w:color="CCCCCC" w:sz="1"/>
+              <w:bottom w:val="single" w:color="CCCCCC" w:sz="1"/>
+              <w:right w:val="single" w:color="CCCCCC" w:sz="1"/>
+            </w:tcBorders>
+            <w:shd w:fill="F2F7FC" w:val="clear"/>
+            <w:tcMar>
+              <w:top w:type="dxa" w:w="80"/>
+              <w:left w:type="dxa" w:w="120"/>
+              <w:bottom w:type="dxa" w:w="80"/>
+              <w:right w:type="dxa" w:w="120"/>
+            </w:tcMar>
+            <w:vAlign w:val="top"/>
+          </w:tcPr>
+          <w:p>
+            <w:pPr>
+              <w:spacing w:after="40" w:before="40"/>
+            </w:pPr>
+            <w:r>
+              <w:rPr>
+                <w:rFonts w:ascii="Arial" w:cs="Arial" w:eastAsia="Arial" w:hAnsi="Arial"/>
+                <w:b w:val="false"/>
+                <w:bCs w:val="false"/>
+                <w:color w:val="1A1A2E"/>
+                <w:sz w:val="20"/>
+                <w:szCs w:val="20"/>
+              </w:rPr>
+              <w:t xml:space="preserve">Agent (LLM)</w:t>
+            </w:r>
+          </w:p>
+        </w:tc>
+        <w:tc>
+          <w:tcPr>
+            <w:tcW w:type="dxa" w:w="7380"/>
+            <w:tcBorders>
+              <w:top w:val="single" w:color="CCCCCC" w:sz="1"/>
+              <w:left w:val="single" w:color="CCCCCC" w:sz="1"/>
+              <w:bottom w:val="single" w:color="CCCCCC" w:sz="1"/>
+              <w:right w:val="single" w:color="CCCCCC" w:sz="1"/>
+            </w:tcBorders>
+            <w:shd w:fill="F2F7FC" w:val="clear"/>
+            <w:tcMar>
+              <w:top w:type="dxa" w:w="80"/>
+              <w:left w:type="dxa" w:w="120"/>
+              <w:bottom w:type="dxa" w:w="80"/>
+              <w:right w:type="dxa" w:w="120"/>
+            </w:tcMar>
+            <w:vAlign w:val="top"/>
+          </w:tcPr>
+          <w:p>
+            <w:pPr>
+              <w:spacing w:after="40" w:before="40"/>
+            </w:pPr>
+            <w:r>
+              <w:rPr>
+                <w:rFonts w:ascii="Arial" w:cs="Arial" w:eastAsia="Arial" w:hAnsi="Arial"/>
+                <w:b w:val="false"/>
+                <w:bCs w:val="false"/>
+                <w:color w:val="1A1A2E"/>
+                <w:sz w:val="20"/>
+                <w:szCs w:val="20"/>
+              </w:rPr>
+              <w:t xml:space="preserve">After all steps complete, the LLM writes a consolidated response drawing on all gathered data.</w:t>
+            </w:r>
+          </w:p>
+        </w:tc>
+      </w:tr>
+      <w:tr>
+        <w:tc>
+          <w:tcPr>
+            <w:tcW w:type="dxa" w:w="540"/>
+            <w:tcBorders>
+              <w:top w:val="single" w:color="CCCCCC" w:sz="1"/>
+              <w:left w:val="single" w:color="CCCCCC" w:sz="1"/>
+              <w:bottom w:val="single" w:color="CCCCCC" w:sz="1"/>
+              <w:right w:val="single" w:color="CCCCCC" w:sz="1"/>
+            </w:tcBorders>
+            <w:shd w:fill="FFFFFF" w:val="clear"/>
+            <w:tcMar>
+              <w:top w:type="dxa" w:w="80"/>
+              <w:left w:type="dxa" w:w="120"/>
+              <w:bottom w:type="dxa" w:w="80"/>
+              <w:right w:type="dxa" w:w="120"/>
+            </w:tcMar>
+            <w:vAlign w:val="top"/>
+          </w:tcPr>
+          <w:p>
+            <w:pPr>
+              <w:spacing w:after="40" w:before="40"/>
+            </w:pPr>
+            <w:r>
+              <w:rPr>
+                <w:rFonts w:ascii="Arial" w:cs="Arial" w:eastAsia="Arial" w:hAnsi="Arial"/>
+                <w:b w:val="false"/>
+                <w:bCs w:val="false"/>
+                <w:color w:val="1A1A2E"/>
+                <w:sz w:val="20"/>
+                <w:szCs w:val="20"/>
+              </w:rPr>
+              <w:t xml:space="preserve">9  Timestamp update</w:t>
+            </w:r>
+          </w:p>
+        </w:tc>
+        <w:tc>
+          <w:tcPr>
+            <w:tcW w:type="dxa" w:w="1440"/>
+            <w:tcBorders>
+              <w:top w:val="single" w:color="CCCCCC" w:sz="1"/>
+              <w:left w:val="single" w:color="CCCCCC" w:sz="1"/>
+              <w:bottom w:val="single" w:color="CCCCCC" w:sz="1"/>
+              <w:right w:val="single" w:color="CCCCCC" w:sz="1"/>
+            </w:tcBorders>
+            <w:shd w:fill="FFFFFF" w:val="clear"/>
+            <w:tcMar>
+              <w:top w:type="dxa" w:w="80"/>
+              <w:left w:type="dxa" w:w="120"/>
+              <w:bottom w:type="dxa" w:w="80"/>
+              <w:right w:type="dxa" w:w="120"/>
+            </w:tcMar>
+            <w:vAlign w:val="top"/>
+          </w:tcPr>
+          <w:p>
+            <w:pPr>
+              <w:spacing w:after="40" w:before="40"/>
+            </w:pPr>
+            <w:r>
+              <w:rPr>
+                <w:rFonts w:ascii="Arial" w:cs="Arial" w:eastAsia="Arial" w:hAnsi="Arial"/>
+                <w:b w:val="false"/>
+                <w:bCs w:val="false"/>
+                <w:color w:val="1A1A2E"/>
+                <w:sz w:val="20"/>
+                <w:szCs w:val="20"/>
+              </w:rPr>
+              <w:t xml:space="preserve">Frontend</w:t>
+            </w:r>
+          </w:p>
+        </w:tc>
+        <w:tc>
+          <w:tcPr>
+            <w:tcW w:type="dxa" w:w="7380"/>
+            <w:tcBorders>
+              <w:top w:val="single" w:color="CCCCCC" w:sz="1"/>
+              <w:left w:val="single" w:color="CCCCCC" w:sz="1"/>
+              <w:bottom w:val="single" w:color="CCCCCC" w:sz="1"/>
+              <w:right w:val="single" w:color="CCCCCC" w:sz="1"/>
+            </w:tcBorders>
+            <w:shd w:fill="FFFFFF" w:val="clear"/>
+            <w:tcMar>
+              <w:top w:type="dxa" w:w="80"/>
+              <w:left w:type="dxa" w:w="120"/>
+              <w:bottom w:type="dxa" w:w="80"/>
+              <w:right w:type="dxa" w:w="120"/>
+            </w:tcMar>
+            <w:vAlign w:val="top"/>
+          </w:tcPr>
+          <w:p>
+            <w:pPr>
+              <w:spacing w:after="40" w:before="40"/>
+            </w:pPr>
+            <w:r>
+              <w:rPr>
+                <w:rFonts w:ascii="Arial" w:cs="Arial" w:eastAsia="Arial" w:hAnsi="Arial"/>
+                <w:b w:val="false"/>
+                <w:bCs w:val="false"/>
+                <w:color w:val="1A1A2E"/>
+                <w:sz w:val="20"/>
+                <w:szCs w:val="20"/>
+              </w:rPr>
+              <w:t xml:space="preserve">On receiving the final response, the frontend calls PATCH /api/workflows/counterparty_intelligence.md/used. The "Last run" timestamp updates in the Workflows section.</w:t>
+            </w:r>
+          </w:p>
+        </w:tc>
+      </w:tr>
+      <w:tr>
+        <w:tc>
+          <w:tcPr>
+            <w:tcW w:type="dxa" w:w="540"/>
+            <w:tcBorders>
+              <w:top w:val="single" w:color="CCCCCC" w:sz="1"/>
+              <w:left w:val="single" w:color="CCCCCC" w:sz="1"/>
+              <w:bottom w:val="single" w:color="CCCCCC" w:sz="1"/>
+              <w:right w:val="single" w:color="CCCCCC" w:sz="1"/>
+            </w:tcBorders>
+            <w:shd w:fill="F2F7FC" w:val="clear"/>
+            <w:tcMar>
+              <w:top w:type="dxa" w:w="80"/>
+              <w:left w:type="dxa" w:w="120"/>
+              <w:bottom w:type="dxa" w:w="80"/>
+              <w:right w:type="dxa" w:w="120"/>
+            </w:tcMar>
+            <w:vAlign w:val="top"/>
+          </w:tcPr>
+          <w:p>
+            <w:pPr>
+              <w:spacing w:after="40" w:before="40"/>
+            </w:pPr>
+            <w:r>
+              <w:rPr>
+                <w:rFonts w:ascii="Arial" w:cs="Arial" w:eastAsia="Arial" w:hAnsi="Arial"/>
+                <w:b w:val="false"/>
+                <w:bCs w:val="false"/>
+                <w:color w:val="1A1A2E"/>
+                <w:sz w:val="20"/>
+                <w:szCs w:val="20"/>
+              </w:rPr>
+              <w:t xml:space="preserve">10  Context clears</w:t>
+            </w:r>
+          </w:p>
+        </w:tc>
+        <w:tc>
+          <w:tcPr>
+            <w:tcW w:type="dxa" w:w="1440"/>
+            <w:tcBorders>
+              <w:top w:val="single" w:color="CCCCCC" w:sz="1"/>
+              <w:left w:val="single" w:color="CCCCCC" w:sz="1"/>
+              <w:bottom w:val="single" w:color="CCCCCC" w:sz="1"/>
+              <w:right w:val="single" w:color="CCCCCC" w:sz="1"/>
+            </w:tcBorders>
+            <w:shd w:fill="F2F7FC" w:val="clear"/>
+            <w:tcMar>
+              <w:top w:type="dxa" w:w="80"/>
+              <w:left w:type="dxa" w:w="120"/>
+              <w:bottom w:type="dxa" w:w="80"/>
+              <w:right w:type="dxa" w:w="120"/>
+            </w:tcMar>
+            <w:vAlign w:val="top"/>
+          </w:tcPr>
+          <w:p>
+            <w:pPr>
+              <w:spacing w:after="40" w:before="40"/>
+            </w:pPr>
+            <w:r>
+              <w:rPr>
+                <w:rFonts w:ascii="Arial" w:cs="Arial" w:eastAsia="Arial" w:hAnsi="Arial"/>
+                <w:b w:val="false"/>
+                <w:bCs w:val="false"/>
+                <w:color w:val="1A1A2E"/>
+                <w:sz w:val="20"/>
+                <w:szCs w:val="20"/>
+              </w:rPr>
+              <w:t xml:space="preserve">Frontend</w:t>
+            </w:r>
+          </w:p>
+        </w:tc>
+        <w:tc>
+          <w:tcPr>
+            <w:tcW w:type="dxa" w:w="7380"/>
+            <w:tcBorders>
+              <w:top w:val="single" w:color="CCCCCC" w:sz="1"/>
+              <w:left w:val="single" w:color="CCCCCC" w:sz="1"/>
+              <w:bottom w:val="single" w:color="CCCCCC" w:sz="1"/>
+              <w:right w:val="single" w:color="CCCCCC" w:sz="1"/>
+            </w:tcBorders>
+            <w:shd w:fill="F2F7FC" w:val="clear"/>
+            <w:tcMar>
+              <w:top w:type="dxa" w:w="80"/>
+              <w:left w:type="dxa" w:w="120"/>
+              <w:bottom w:type="dxa" w:w="80"/>
+              <w:right w:type="dxa" w:w="120"/>
+            </w:tcMar>
+            <w:vAlign w:val="top"/>
+          </w:tcPr>
+          <w:p>
+            <w:pPr>
+              <w:spacing w:after="40" w:before="40"/>
+            </w:pPr>
+            <w:r>
+              <w:rPr>
+                <w:rFonts w:ascii="Arial" w:cs="Arial" w:eastAsia="Arial" w:hAnsi="Arial"/>
+                <w:b w:val="false"/>
+                <w:bCs w:val="false"/>
+                <w:color w:val="1A1A2E"/>
+                <w:sz w:val="20"/>
+                <w:szCs w:val="20"/>
+              </w:rPr>
+              <w:t xml:space="preserve">panelState.selectedDocs and panelState.selectedWorkflow reset to empty. Context bar hides.</w:t>
+            </w:r>
+          </w:p>
+        </w:tc>
+      </w:tr>
+    </w:tbl>
+    <w:p>
+      <w:pPr>
+        <w:spacing w:after="80" w:before="0"/>
+      </w:pPr>
+      <w:r>
+        <w:rPr>
+          <w:rFonts w:ascii="Arial" w:cs="Arial" w:eastAsia="Arial" w:hAnsi="Arial"/>
+          <w:sz w:val="22"/>
+          <w:szCs w:val="22"/>
+        </w:rPr>
+        <w:t xml:space="preserve"/>
+      </w:r>
+    </w:p>
+    <w:p>
+      <w:pPr>
+        <w:shd w:fill="FFF2CC" w:val="clear"/>
+        <w:spacing w:after="120" w:before="120"/>
+        <w:ind w:left="180" w:right="180"/>
+      </w:pPr>
+      <w:r>
+        <w:rPr>
+          <w:rFonts w:ascii="Arial" w:cs="Arial" w:eastAsia="Arial" w:hAnsi="Arial"/>
+          <w:b/>
+          <w:bCs/>
+          <w:color w:val="7F6000"/>
+          <w:sz w:val="20"/>
+          <w:szCs w:val="20"/>
+        </w:rPr>
+        <w:t xml:space="preserve">NOTE  </w:t>
+      </w:r>
+      <w:r>
+        <w:rPr>
+          <w:rFonts w:ascii="Arial" w:cs="Arial" w:eastAsia="Arial" w:hAnsi="Arial"/>
+          <w:color w:val="1A1A2E"/>
+          <w:sz w:val="20"/>
+          <w:szCs w:val="20"/>
+        </w:rPr>
+        <w:t xml:space="preserve">The LLM is the workflow engine — there is no server-side step scheduler or state machine. The MD file is inlined into the prompt, and the LLM executes instructions sequentially using its own context window to chain step outputs. This means workflow complexity lives entirely in the MD file authoring, not in any backend code.</w:t>
       </w:r>
     </w:p>
     <w:p>
@@ -9922,7 +11218,1609 @@
           <w:sz w:val="28"/>
           <w:szCs w:val="28"/>
         </w:rPr>
-        <w:t xml:space="preserve">9. Acceptance Criteria</w:t>
+        <w:t xml:space="preserve">9. UX Enhancement Notes</w:t>
+      </w:r>
+    </w:p>
+    <w:p>
+      <w:pPr>
+        <w:spacing w:after="80" w:before="80"/>
+      </w:pPr>
+      <w:r>
+        <w:rPr>
+          <w:rFonts w:ascii="Arial" w:cs="Arial" w:eastAsia="Arial" w:hAnsi="Arial"/>
+          <w:color w:val="1A1A2E"/>
+          <w:sz w:val="22"/>
+          <w:szCs w:val="22"/>
+        </w:rPr>
+        <w:t xml:space="preserve">The following UX improvements are recommended beyond the base feature. Items are listed in priority order. They can be implemented as follow-on tasks after the core feature ships.</w:t>
+      </w:r>
+    </w:p>
+    <w:p>
+      <w:pPr>
+        <w:spacing w:after="80" w:before="0"/>
+      </w:pPr>
+      <w:r>
+        <w:rPr>
+          <w:rFonts w:ascii="Arial" w:cs="Arial" w:eastAsia="Arial" w:hAnsi="Arial"/>
+          <w:sz w:val="22"/>
+          <w:szCs w:val="22"/>
+        </w:rPr>
+        <w:t xml:space="preserve"/>
+      </w:r>
+    </w:p>
+    <w:p>
+      <w:pPr>
+        <w:pStyle w:val="Heading2"/>
+        <w:pBdr>
+          <w:bottom w:val="single" w:color="2E75B6" w:sz="4" w:space="2"/>
+        </w:pBdr>
+        <w:spacing w:after="100" w:before="200"/>
+      </w:pPr>
+      <w:r>
+        <w:rPr>
+          <w:rFonts w:ascii="Arial" w:cs="Arial" w:eastAsia="Arial" w:hAnsi="Arial"/>
+          <w:b/>
+          <w:bCs/>
+          <w:color w:val="1F3864"/>
+          <w:sz w:val="24"/>
+          <w:szCs w:val="24"/>
+        </w:rPr>
+        <w:t xml:space="preserve">9.1 Workflow Input Hints (High Priority)</w:t>
+      </w:r>
+    </w:p>
+    <w:p>
+      <w:pPr>
+        <w:spacing w:after="80" w:before="80"/>
+      </w:pPr>
+      <w:r>
+        <w:rPr>
+          <w:rFonts w:ascii="Arial" w:cs="Arial" w:eastAsia="Arial" w:hAnsi="Arial"/>
+          <w:color w:val="1A1A2E"/>
+          <w:sz w:val="22"/>
+          <w:szCs w:val="22"/>
+        </w:rPr>
+        <w:t xml:space="preserve">When a workflow is selected, the chat input placeholder should surface the expected inputs from the workflow's MD file. If the MD contains an "## Inputs:" section, parse it and render hints directly in the chat input bar placeholder text.</w:t>
+      </w:r>
+    </w:p>
+    <w:p>
+      <w:pPr>
+        <w:shd w:fill="F0F4F8" w:val="clear"/>
+        <w:spacing w:after="20" w:before="20"/>
+        <w:ind w:left="360"/>
+      </w:pPr>
+      <w:r>
+        <w:rPr>
+          <w:rFonts w:ascii="Courier New" w:cs="Courier New" w:eastAsia="Courier New" w:hAnsi="Courier New"/>
+          <w:color w:val="1F3864"/>
+          <w:sz w:val="18"/>
+          <w:szCs w:val="18"/>
+        </w:rPr>
+        <w:t xml:space="preserve">## Inputs:</w:t>
+      </w:r>
+    </w:p>
+    <w:p>
+      <w:pPr>
+        <w:shd w:fill="F0F4F8" w:val="clear"/>
+        <w:spacing w:after="20" w:before="20"/>
+        <w:ind w:left="360"/>
+      </w:pPr>
+      <w:r>
+        <w:rPr>
+          <w:rFonts w:ascii="Courier New" w:cs="Courier New" w:eastAsia="Courier New" w:hAnsi="Courier New"/>
+          <w:color w:val="1F3864"/>
+          <w:sz w:val="18"/>
+          <w:szCs w:val="18"/>
+        </w:rPr>
+        <w:t xml:space="preserve">- Counterparty name or CIK</w:t>
+      </w:r>
+    </w:p>
+    <w:p>
+      <w:pPr>
+        <w:shd w:fill="F0F4F8" w:val="clear"/>
+        <w:spacing w:after="20" w:before="20"/>
+        <w:ind w:left="360"/>
+      </w:pPr>
+      <w:r>
+        <w:rPr>
+          <w:rFonts w:ascii="Courier New" w:cs="Courier New" w:eastAsia="Courier New" w:hAnsi="Courier New"/>
+          <w:color w:val="1F3864"/>
+          <w:sz w:val="18"/>
+          <w:szCs w:val="18"/>
+        </w:rPr>
+        <w:t xml:space="preserve">- Date (optional, defaults to latest)</w:t>
+      </w:r>
+    </w:p>
+    <w:p>
+      <w:pPr>
+        <w:spacing w:after="80" w:before="80"/>
+      </w:pPr>
+      <w:r>
+        <w:rPr>
+          <w:rFonts w:ascii="Arial" w:cs="Arial" w:eastAsia="Arial" w:hAnsi="Arial"/>
+          <w:color w:val="1A1A2E"/>
+          <w:sz w:val="22"/>
+          <w:szCs w:val="22"/>
+        </w:rPr>
+        <w:t xml:space="preserve">→ Placeholder becomes: "Provide counterparty name, date (optional)..." This eliminates user guesswork about what to type.</w:t>
+      </w:r>
+    </w:p>
+    <w:p>
+      <w:pPr>
+        <w:spacing w:after="80" w:before="0"/>
+      </w:pPr>
+      <w:r>
+        <w:rPr>
+          <w:rFonts w:ascii="Arial" w:cs="Arial" w:eastAsia="Arial" w:hAnsi="Arial"/>
+          <w:sz w:val="22"/>
+          <w:szCs w:val="22"/>
+        </w:rPr>
+        <w:t xml:space="preserve"/>
+      </w:r>
+    </w:p>
+    <w:p>
+      <w:pPr>
+        <w:pStyle w:val="Heading2"/>
+        <w:pBdr>
+          <w:bottom w:val="single" w:color="2E75B6" w:sz="4" w:space="2"/>
+        </w:pBdr>
+        <w:spacing w:after="100" w:before="200"/>
+      </w:pPr>
+      <w:r>
+        <w:rPr>
+          <w:rFonts w:ascii="Arial" w:cs="Arial" w:eastAsia="Arial" w:hAnsi="Arial"/>
+          <w:b/>
+          <w:bCs/>
+          <w:color w:val="1F3864"/>
+          <w:sz w:val="24"/>
+          <w:szCs w:val="24"/>
+        </w:rPr>
+        <w:t xml:space="preserve">9.2 Workflow Step Preview on Hover (High Priority)</w:t>
+      </w:r>
+    </w:p>
+    <w:p>
+      <w:pPr>
+        <w:spacing w:after="80" w:before="80"/>
+      </w:pPr>
+      <w:r>
+        <w:rPr>
+          <w:rFonts w:ascii="Arial" w:cs="Arial" w:eastAsia="Arial" w:hAnsi="Arial"/>
+          <w:color w:val="1A1A2E"/>
+          <w:sz w:val="22"/>
+          <w:szCs w:val="22"/>
+        </w:rPr>
+        <w:t xml:space="preserve">Hovering over a workflow row shows a popover card on the right side listing the step titles from the MD file (H2/H3 headings). This lets the user understand exactly what will execute before selecting. The popover disappears on mouse-out and does not block the file list.</w:t>
+      </w:r>
+    </w:p>
+    <w:p>
+      <w:pPr>
+        <w:spacing w:after="80" w:before="0"/>
+      </w:pPr>
+      <w:r>
+        <w:rPr>
+          <w:rFonts w:ascii="Arial" w:cs="Arial" w:eastAsia="Arial" w:hAnsi="Arial"/>
+          <w:sz w:val="22"/>
+          <w:szCs w:val="22"/>
+        </w:rPr>
+        <w:t xml:space="preserve"/>
+      </w:r>
+    </w:p>
+    <w:p>
+      <w:pPr>
+        <w:pStyle w:val="Heading2"/>
+        <w:pBdr>
+          <w:bottom w:val="single" w:color="2E75B6" w:sz="4" w:space="2"/>
+        </w:pBdr>
+        <w:spacing w:after="100" w:before="200"/>
+      </w:pPr>
+      <w:r>
+        <w:rPr>
+          <w:rFonts w:ascii="Arial" w:cs="Arial" w:eastAsia="Arial" w:hAnsi="Arial"/>
+          <w:b/>
+          <w:bCs/>
+          <w:color w:val="1F3864"/>
+          <w:sz w:val="24"/>
+          <w:szCs w:val="24"/>
+        </w:rPr>
+        <w:t xml:space="preserve">9.3 Execution Progress Indicator (Medium Priority)</w:t>
+      </w:r>
+    </w:p>
+    <w:p>
+      <w:pPr>
+        <w:spacing w:after="80" w:before="80"/>
+      </w:pPr>
+      <w:r>
+        <w:rPr>
+          <w:rFonts w:ascii="Arial" w:cs="Arial" w:eastAsia="Arial" w:hAnsi="Arial"/>
+          <w:color w:val="1A1A2E"/>
+          <w:sz w:val="22"/>
+          <w:szCs w:val="22"/>
+        </w:rPr>
+        <w:t xml:space="preserve">While the agent is executing a workflow (streaming response), the workflow tag in the context bar should show an animated spinner inside the purple chip: [⚙ ↻ CCR Analysis]. This confirms to the user that the workflow is actively running, not stalled. The spinner stops when the streaming response ends.</w:t>
+      </w:r>
+    </w:p>
+    <w:p>
+      <w:pPr>
+        <w:spacing w:after="80" w:before="0"/>
+      </w:pPr>
+      <w:r>
+        <w:rPr>
+          <w:rFonts w:ascii="Arial" w:cs="Arial" w:eastAsia="Arial" w:hAnsi="Arial"/>
+          <w:sz w:val="22"/>
+          <w:szCs w:val="22"/>
+        </w:rPr>
+        <w:t xml:space="preserve"/>
+      </w:r>
+    </w:p>
+    <w:p>
+      <w:pPr>
+        <w:pStyle w:val="Heading2"/>
+        <w:pBdr>
+          <w:bottom w:val="single" w:color="2E75B6" w:sz="4" w:space="2"/>
+        </w:pBdr>
+        <w:spacing w:after="100" w:before="200"/>
+      </w:pPr>
+      <w:r>
+        <w:rPr>
+          <w:rFonts w:ascii="Arial" w:cs="Arial" w:eastAsia="Arial" w:hAnsi="Arial"/>
+          <w:b/>
+          <w:bCs/>
+          <w:color w:val="1F3864"/>
+          <w:sz w:val="24"/>
+          <w:szCs w:val="24"/>
+        </w:rPr>
+        <w:t xml:space="preserve">9.4 Sticky Workflow Context (Medium Priority)</w:t>
+      </w:r>
+    </w:p>
+    <w:p>
+      <w:pPr>
+        <w:spacing w:after="80" w:before="80"/>
+      </w:pPr>
+      <w:r>
+        <w:rPr>
+          <w:rFonts w:ascii="Arial" w:cs="Arial" w:eastAsia="Arial" w:hAnsi="Arial"/>
+          <w:color w:val="1A1A2E"/>
+          <w:sz w:val="22"/>
+          <w:szCs w:val="22"/>
+        </w:rPr>
+        <w:t xml:space="preserve">Currently the context bar clears after every send. For multi-turn workflow sessions (e.g. "now do the same analysis for counterparty Y") the user has to re-select the workflow each time. Add a pin icon (📌) on the workflow tag that, when clicked, keeps the workflow selected across sends until explicitly unpinned. Pinned state is stored in panelState.pinnedWorkflow and is NOT cleared by the post-send reset.</w:t>
+      </w:r>
+    </w:p>
+    <w:p>
+      <w:pPr>
+        <w:spacing w:after="80" w:before="0"/>
+      </w:pPr>
+      <w:r>
+        <w:rPr>
+          <w:rFonts w:ascii="Arial" w:cs="Arial" w:eastAsia="Arial" w:hAnsi="Arial"/>
+          <w:sz w:val="22"/>
+          <w:szCs w:val="22"/>
+        </w:rPr>
+        <w:t xml:space="preserve"/>
+      </w:r>
+    </w:p>
+    <w:p>
+      <w:pPr>
+        <w:pStyle w:val="Heading2"/>
+        <w:pBdr>
+          <w:bottom w:val="single" w:color="2E75B6" w:sz="4" w:space="2"/>
+        </w:pBdr>
+        <w:spacing w:after="100" w:before="200"/>
+      </w:pPr>
+      <w:r>
+        <w:rPr>
+          <w:rFonts w:ascii="Arial" w:cs="Arial" w:eastAsia="Arial" w:hAnsi="Arial"/>
+          <w:b/>
+          <w:bCs/>
+          <w:color w:val="1F3864"/>
+          <w:sz w:val="24"/>
+          <w:szCs w:val="24"/>
+        </w:rPr>
+        <w:t xml:space="preserve">9.5 Workspace Search / Filter (Low Priority)</w:t>
+      </w:r>
+    </w:p>
+    <w:p>
+      <w:pPr>
+        <w:spacing w:after="80" w:before="80"/>
+      </w:pPr>
+      <w:r>
+        <w:rPr>
+          <w:rFonts w:ascii="Arial" w:cs="Arial" w:eastAsia="Arial" w:hAnsi="Arial"/>
+          <w:color w:val="1A1A2E"/>
+          <w:sz w:val="22"/>
+          <w:szCs w:val="22"/>
+        </w:rPr>
+        <w:t xml:space="preserve">When the uploads folder grows beyond ~10 files, a search box at the top of the My Workspace section allows filtering the file list by name in real time (client-side filter on panelState.files). No server call needed. The search box only renders when panelState.files.length &gt; 8.</w:t>
+      </w:r>
+    </w:p>
+    <w:p>
+      <w:pPr>
+        <w:spacing w:after="80" w:before="0"/>
+      </w:pPr>
+      <w:r>
+        <w:rPr>
+          <w:rFonts w:ascii="Arial" w:cs="Arial" w:eastAsia="Arial" w:hAnsi="Arial"/>
+          <w:sz w:val="22"/>
+          <w:szCs w:val="22"/>
+        </w:rPr>
+        <w:t xml:space="preserve"/>
+      </w:r>
+    </w:p>
+    <w:p>
+      <w:pPr>
+        <w:pStyle w:val="Heading2"/>
+        <w:pBdr>
+          <w:bottom w:val="single" w:color="2E75B6" w:sz="4" w:space="2"/>
+        </w:pBdr>
+        <w:spacing w:after="100" w:before="200"/>
+      </w:pPr>
+      <w:r>
+        <w:rPr>
+          <w:rFonts w:ascii="Arial" w:cs="Arial" w:eastAsia="Arial" w:hAnsi="Arial"/>
+          <w:b/>
+          <w:bCs/>
+          <w:color w:val="1F3864"/>
+          <w:sz w:val="24"/>
+          <w:szCs w:val="24"/>
+        </w:rPr>
+        <w:t xml:space="preserve">9.6 Suggested Prompt on Workflow Select (Low Priority)</w:t>
+      </w:r>
+    </w:p>
+    <w:p>
+      <w:pPr>
+        <w:spacing w:after="80" w:before="80"/>
+      </w:pPr>
+      <w:r>
+        <w:rPr>
+          <w:rFonts w:ascii="Arial" w:cs="Arial" w:eastAsia="Arial" w:hAnsi="Arial"/>
+          <w:color w:val="1A1A2E"/>
+          <w:sz w:val="22"/>
+          <w:szCs w:val="22"/>
+        </w:rPr>
+        <w:t xml:space="preserve">When a user selects a workflow, auto-populate the chat input with a suggested starter message derived from the workflow's name, e.g. "Run CCR Analysis on [selected doc]". The text is editable — it is a suggestion, not a command. This reduces the blank-input barrier for new users.</w:t>
+      </w:r>
+    </w:p>
+    <w:p>
+      <w:pPr>
+        <w:spacing w:after="80" w:before="0"/>
+      </w:pPr>
+      <w:r>
+        <w:rPr>
+          <w:rFonts w:ascii="Arial" w:cs="Arial" w:eastAsia="Arial" w:hAnsi="Arial"/>
+          <w:sz w:val="22"/>
+          <w:szCs w:val="22"/>
+        </w:rPr>
+        <w:t xml:space="preserve"/>
+      </w:r>
+    </w:p>
+    <w:p>
+      <w:pPr>
+        <w:pStyle w:val="Heading2"/>
+        <w:pBdr>
+          <w:bottom w:val="single" w:color="2E75B6" w:sz="4" w:space="2"/>
+        </w:pBdr>
+        <w:spacing w:after="100" w:before="200"/>
+      </w:pPr>
+      <w:r>
+        <w:rPr>
+          <w:rFonts w:ascii="Arial" w:cs="Arial" w:eastAsia="Arial" w:hAnsi="Arial"/>
+          <w:b/>
+          <w:bCs/>
+          <w:color w:val="1F3864"/>
+          <w:sz w:val="24"/>
+          <w:szCs w:val="24"/>
+        </w:rPr>
+        <w:t xml:space="preserve">9.7 Workflow Run Quick-Action Button (Low Priority)</w:t>
+      </w:r>
+    </w:p>
+    <w:p>
+      <w:pPr>
+        <w:spacing w:after="80" w:before="80"/>
+      </w:pPr>
+      <w:r>
+        <w:rPr>
+          <w:rFonts w:ascii="Arial" w:cs="Arial" w:eastAsia="Arial" w:hAnsi="Arial"/>
+          <w:color w:val="1A1A2E"/>
+          <w:sz w:val="22"/>
+          <w:szCs w:val="22"/>
+        </w:rPr>
+        <w:t xml:space="preserve">A ▶ Run button on the workflow row (visible on hover, next to the trash icon) selects the workflow AND immediately sends the default starter message — equivalent to click-select + type + send in one action. This is a power-user shortcut for workflows that need no additional input.</w:t>
+      </w:r>
+    </w:p>
+    <w:p>
+      <w:pPr>
+        <w:spacing w:after="80" w:before="0"/>
+      </w:pPr>
+      <w:r>
+        <w:rPr>
+          <w:rFonts w:ascii="Arial" w:cs="Arial" w:eastAsia="Arial" w:hAnsi="Arial"/>
+          <w:sz w:val="22"/>
+          <w:szCs w:val="22"/>
+        </w:rPr>
+        <w:t xml:space="preserve"/>
+      </w:r>
+    </w:p>
+    <w:tbl>
+      <w:tblPr>
+        <w:tblW w:type="dxa" w:w="9360"/>
+        <w:tblBorders>
+          <w:top w:val="single" w:color="auto" w:sz="4"/>
+          <w:left w:val="single" w:color="auto" w:sz="4"/>
+          <w:bottom w:val="single" w:color="auto" w:sz="4"/>
+          <w:right w:val="single" w:color="auto" w:sz="4"/>
+          <w:insideH w:val="single" w:color="auto" w:sz="4"/>
+          <w:insideV w:val="single" w:color="auto" w:sz="4"/>
+        </w:tblBorders>
+      </w:tblPr>
+      <w:tblGrid>
+        <w:gridCol w:w="2520"/>
+        <w:gridCol w:w="1080"/>
+        <w:gridCol w:w="2880"/>
+        <w:gridCol w:w="2880"/>
+      </w:tblGrid>
+      <w:tr>
+        <w:trPr>
+          <w:tblHeader/>
+        </w:trPr>
+        <w:tc>
+          <w:tcPr>
+            <w:tcW w:type="dxa" w:w="2520"/>
+            <w:tcBorders>
+              <w:top w:val="single" w:color="CCCCCC" w:sz="1"/>
+              <w:left w:val="single" w:color="CCCCCC" w:sz="1"/>
+              <w:bottom w:val="single" w:color="CCCCCC" w:sz="1"/>
+              <w:right w:val="single" w:color="CCCCCC" w:sz="1"/>
+            </w:tcBorders>
+            <w:shd w:fill="1F3864" w:val="clear"/>
+            <w:tcMar>
+              <w:top w:type="dxa" w:w="80"/>
+              <w:left w:type="dxa" w:w="120"/>
+              <w:bottom w:type="dxa" w:w="80"/>
+              <w:right w:type="dxa" w:w="120"/>
+            </w:tcMar>
+            <w:vAlign w:val="center"/>
+          </w:tcPr>
+          <w:p>
+            <w:r>
+              <w:rPr>
+                <w:rFonts w:ascii="Arial" w:cs="Arial" w:eastAsia="Arial" w:hAnsi="Arial"/>
+                <w:b/>
+                <w:bCs/>
+                <w:color w:val="FFFFFF"/>
+                <w:sz w:val="20"/>
+                <w:szCs w:val="20"/>
+              </w:rPr>
+              <w:t xml:space="preserve">Enhancement</w:t>
+            </w:r>
+          </w:p>
+        </w:tc>
+        <w:tc>
+          <w:tcPr>
+            <w:tcW w:type="dxa" w:w="1080"/>
+            <w:tcBorders>
+              <w:top w:val="single" w:color="CCCCCC" w:sz="1"/>
+              <w:left w:val="single" w:color="CCCCCC" w:sz="1"/>
+              <w:bottom w:val="single" w:color="CCCCCC" w:sz="1"/>
+              <w:right w:val="single" w:color="CCCCCC" w:sz="1"/>
+            </w:tcBorders>
+            <w:shd w:fill="1F3864" w:val="clear"/>
+            <w:tcMar>
+              <w:top w:type="dxa" w:w="80"/>
+              <w:left w:type="dxa" w:w="120"/>
+              <w:bottom w:type="dxa" w:w="80"/>
+              <w:right w:type="dxa" w:w="120"/>
+            </w:tcMar>
+            <w:vAlign w:val="center"/>
+          </w:tcPr>
+          <w:p>
+            <w:r>
+              <w:rPr>
+                <w:rFonts w:ascii="Arial" w:cs="Arial" w:eastAsia="Arial" w:hAnsi="Arial"/>
+                <w:b/>
+                <w:bCs/>
+                <w:color w:val="FFFFFF"/>
+                <w:sz w:val="20"/>
+                <w:szCs w:val="20"/>
+              </w:rPr>
+              <w:t xml:space="preserve">Priority</w:t>
+            </w:r>
+          </w:p>
+        </w:tc>
+        <w:tc>
+          <w:tcPr>
+            <w:tcW w:type="dxa" w:w="2880"/>
+            <w:tcBorders>
+              <w:top w:val="single" w:color="CCCCCC" w:sz="1"/>
+              <w:left w:val="single" w:color="CCCCCC" w:sz="1"/>
+              <w:bottom w:val="single" w:color="CCCCCC" w:sz="1"/>
+              <w:right w:val="single" w:color="CCCCCC" w:sz="1"/>
+            </w:tcBorders>
+            <w:shd w:fill="1F3864" w:val="clear"/>
+            <w:tcMar>
+              <w:top w:type="dxa" w:w="80"/>
+              <w:left w:type="dxa" w:w="120"/>
+              <w:bottom w:type="dxa" w:w="80"/>
+              <w:right w:type="dxa" w:w="120"/>
+            </w:tcMar>
+            <w:vAlign w:val="center"/>
+          </w:tcPr>
+          <w:p>
+            <w:r>
+              <w:rPr>
+                <w:rFonts w:ascii="Arial" w:cs="Arial" w:eastAsia="Arial" w:hAnsi="Arial"/>
+                <w:b/>
+                <w:bCs/>
+                <w:color w:val="FFFFFF"/>
+                <w:sz w:val="20"/>
+                <w:szCs w:val="20"/>
+              </w:rPr>
+              <w:t xml:space="preserve">Effort</w:t>
+            </w:r>
+          </w:p>
+        </w:tc>
+        <w:tc>
+          <w:tcPr>
+            <w:tcW w:type="dxa" w:w="2880"/>
+            <w:tcBorders>
+              <w:top w:val="single" w:color="CCCCCC" w:sz="1"/>
+              <w:left w:val="single" w:color="CCCCCC" w:sz="1"/>
+              <w:bottom w:val="single" w:color="CCCCCC" w:sz="1"/>
+              <w:right w:val="single" w:color="CCCCCC" w:sz="1"/>
+            </w:tcBorders>
+            <w:shd w:fill="1F3864" w:val="clear"/>
+            <w:tcMar>
+              <w:top w:type="dxa" w:w="80"/>
+              <w:left w:type="dxa" w:w="120"/>
+              <w:bottom w:type="dxa" w:w="80"/>
+              <w:right w:type="dxa" w:w="120"/>
+            </w:tcMar>
+            <w:vAlign w:val="center"/>
+          </w:tcPr>
+          <w:p>
+            <w:r>
+              <w:rPr>
+                <w:rFonts w:ascii="Arial" w:cs="Arial" w:eastAsia="Arial" w:hAnsi="Arial"/>
+                <w:b/>
+                <w:bCs/>
+                <w:color w:val="FFFFFF"/>
+                <w:sz w:val="20"/>
+                <w:szCs w:val="20"/>
+              </w:rPr>
+              <w:t xml:space="preserve">Impact</w:t>
+            </w:r>
+          </w:p>
+        </w:tc>
+      </w:tr>
+      <w:tr>
+        <w:tc>
+          <w:tcPr>
+            <w:tcW w:type="dxa" w:w="2520"/>
+            <w:tcBorders>
+              <w:top w:val="single" w:color="CCCCCC" w:sz="1"/>
+              <w:left w:val="single" w:color="CCCCCC" w:sz="1"/>
+              <w:bottom w:val="single" w:color="CCCCCC" w:sz="1"/>
+              <w:right w:val="single" w:color="CCCCCC" w:sz="1"/>
+            </w:tcBorders>
+            <w:shd w:fill="FFFFFF" w:val="clear"/>
+            <w:tcMar>
+              <w:top w:type="dxa" w:w="80"/>
+              <w:left w:type="dxa" w:w="120"/>
+              <w:bottom w:type="dxa" w:w="80"/>
+              <w:right w:type="dxa" w:w="120"/>
+            </w:tcMar>
+            <w:vAlign w:val="top"/>
+          </w:tcPr>
+          <w:p>
+            <w:pPr>
+              <w:spacing w:after="40" w:before="40"/>
+            </w:pPr>
+            <w:r>
+              <w:rPr>
+                <w:rFonts w:ascii="Arial" w:cs="Arial" w:eastAsia="Arial" w:hAnsi="Arial"/>
+                <w:b w:val="false"/>
+                <w:bCs w:val="false"/>
+                <w:color w:val="1A1A2E"/>
+                <w:sz w:val="20"/>
+                <w:szCs w:val="20"/>
+              </w:rPr>
+              <w:t xml:space="preserve">9.1 Input hints from ## Inputs: in MD</w:t>
+            </w:r>
+          </w:p>
+        </w:tc>
+        <w:tc>
+          <w:tcPr>
+            <w:tcW w:type="dxa" w:w="1080"/>
+            <w:tcBorders>
+              <w:top w:val="single" w:color="CCCCCC" w:sz="1"/>
+              <w:left w:val="single" w:color="CCCCCC" w:sz="1"/>
+              <w:bottom w:val="single" w:color="CCCCCC" w:sz="1"/>
+              <w:right w:val="single" w:color="CCCCCC" w:sz="1"/>
+            </w:tcBorders>
+            <w:shd w:fill="FFFFFF" w:val="clear"/>
+            <w:tcMar>
+              <w:top w:type="dxa" w:w="80"/>
+              <w:left w:type="dxa" w:w="120"/>
+              <w:bottom w:type="dxa" w:w="80"/>
+              <w:right w:type="dxa" w:w="120"/>
+            </w:tcMar>
+            <w:vAlign w:val="top"/>
+          </w:tcPr>
+          <w:p>
+            <w:pPr>
+              <w:spacing w:after="40" w:before="40"/>
+            </w:pPr>
+            <w:r>
+              <w:rPr>
+                <w:rFonts w:ascii="Arial" w:cs="Arial" w:eastAsia="Arial" w:hAnsi="Arial"/>
+                <w:b w:val="false"/>
+                <w:bCs w:val="false"/>
+                <w:color w:val="1A1A2E"/>
+                <w:sz w:val="20"/>
+                <w:szCs w:val="20"/>
+              </w:rPr>
+              <w:t xml:space="preserve">High</w:t>
+            </w:r>
+          </w:p>
+        </w:tc>
+        <w:tc>
+          <w:tcPr>
+            <w:tcW w:type="dxa" w:w="2880"/>
+            <w:tcBorders>
+              <w:top w:val="single" w:color="CCCCCC" w:sz="1"/>
+              <w:left w:val="single" w:color="CCCCCC" w:sz="1"/>
+              <w:bottom w:val="single" w:color="CCCCCC" w:sz="1"/>
+              <w:right w:val="single" w:color="CCCCCC" w:sz="1"/>
+            </w:tcBorders>
+            <w:shd w:fill="FFFFFF" w:val="clear"/>
+            <w:tcMar>
+              <w:top w:type="dxa" w:w="80"/>
+              <w:left w:type="dxa" w:w="120"/>
+              <w:bottom w:type="dxa" w:w="80"/>
+              <w:right w:type="dxa" w:w="120"/>
+            </w:tcMar>
+            <w:vAlign w:val="top"/>
+          </w:tcPr>
+          <w:p>
+            <w:pPr>
+              <w:spacing w:after="40" w:before="40"/>
+            </w:pPr>
+            <w:r>
+              <w:rPr>
+                <w:rFonts w:ascii="Arial" w:cs="Arial" w:eastAsia="Arial" w:hAnsi="Arial"/>
+                <w:b w:val="false"/>
+                <w:bCs w:val="false"/>
+                <w:color w:val="1A1A2E"/>
+                <w:sz w:val="20"/>
+                <w:szCs w:val="20"/>
+              </w:rPr>
+              <w:t xml:space="preserve">Low — read first MD section, update placeholder</w:t>
+            </w:r>
+          </w:p>
+        </w:tc>
+        <w:tc>
+          <w:tcPr>
+            <w:tcW w:type="dxa" w:w="2880"/>
+            <w:tcBorders>
+              <w:top w:val="single" w:color="CCCCCC" w:sz="1"/>
+              <w:left w:val="single" w:color="CCCCCC" w:sz="1"/>
+              <w:bottom w:val="single" w:color="CCCCCC" w:sz="1"/>
+              <w:right w:val="single" w:color="CCCCCC" w:sz="1"/>
+            </w:tcBorders>
+            <w:shd w:fill="FFFFFF" w:val="clear"/>
+            <w:tcMar>
+              <w:top w:type="dxa" w:w="80"/>
+              <w:left w:type="dxa" w:w="120"/>
+              <w:bottom w:type="dxa" w:w="80"/>
+              <w:right w:type="dxa" w:w="120"/>
+            </w:tcMar>
+            <w:vAlign w:val="top"/>
+          </w:tcPr>
+          <w:p>
+            <w:pPr>
+              <w:spacing w:after="40" w:before="40"/>
+            </w:pPr>
+            <w:r>
+              <w:rPr>
+                <w:rFonts w:ascii="Arial" w:cs="Arial" w:eastAsia="Arial" w:hAnsi="Arial"/>
+                <w:b w:val="false"/>
+                <w:bCs w:val="false"/>
+                <w:color w:val="1A1A2E"/>
+                <w:sz w:val="20"/>
+                <w:szCs w:val="20"/>
+              </w:rPr>
+              <w:t xml:space="preserve">Eliminates blank-input confusion for new users</w:t>
+            </w:r>
+          </w:p>
+        </w:tc>
+      </w:tr>
+      <w:tr>
+        <w:tc>
+          <w:tcPr>
+            <w:tcW w:type="dxa" w:w="2520"/>
+            <w:tcBorders>
+              <w:top w:val="single" w:color="CCCCCC" w:sz="1"/>
+              <w:left w:val="single" w:color="CCCCCC" w:sz="1"/>
+              <w:bottom w:val="single" w:color="CCCCCC" w:sz="1"/>
+              <w:right w:val="single" w:color="CCCCCC" w:sz="1"/>
+            </w:tcBorders>
+            <w:shd w:fill="F2F7FC" w:val="clear"/>
+            <w:tcMar>
+              <w:top w:type="dxa" w:w="80"/>
+              <w:left w:type="dxa" w:w="120"/>
+              <w:bottom w:type="dxa" w:w="80"/>
+              <w:right w:type="dxa" w:w="120"/>
+            </w:tcMar>
+            <w:vAlign w:val="top"/>
+          </w:tcPr>
+          <w:p>
+            <w:pPr>
+              <w:spacing w:after="40" w:before="40"/>
+            </w:pPr>
+            <w:r>
+              <w:rPr>
+                <w:rFonts w:ascii="Arial" w:cs="Arial" w:eastAsia="Arial" w:hAnsi="Arial"/>
+                <w:b w:val="false"/>
+                <w:bCs w:val="false"/>
+                <w:color w:val="1A1A2E"/>
+                <w:sz w:val="20"/>
+                <w:szCs w:val="20"/>
+              </w:rPr>
+              <w:t xml:space="preserve">9.2 Step preview on hover</w:t>
+            </w:r>
+          </w:p>
+        </w:tc>
+        <w:tc>
+          <w:tcPr>
+            <w:tcW w:type="dxa" w:w="1080"/>
+            <w:tcBorders>
+              <w:top w:val="single" w:color="CCCCCC" w:sz="1"/>
+              <w:left w:val="single" w:color="CCCCCC" w:sz="1"/>
+              <w:bottom w:val="single" w:color="CCCCCC" w:sz="1"/>
+              <w:right w:val="single" w:color="CCCCCC" w:sz="1"/>
+            </w:tcBorders>
+            <w:shd w:fill="F2F7FC" w:val="clear"/>
+            <w:tcMar>
+              <w:top w:type="dxa" w:w="80"/>
+              <w:left w:type="dxa" w:w="120"/>
+              <w:bottom w:type="dxa" w:w="80"/>
+              <w:right w:type="dxa" w:w="120"/>
+            </w:tcMar>
+            <w:vAlign w:val="top"/>
+          </w:tcPr>
+          <w:p>
+            <w:pPr>
+              <w:spacing w:after="40" w:before="40"/>
+            </w:pPr>
+            <w:r>
+              <w:rPr>
+                <w:rFonts w:ascii="Arial" w:cs="Arial" w:eastAsia="Arial" w:hAnsi="Arial"/>
+                <w:b w:val="false"/>
+                <w:bCs w:val="false"/>
+                <w:color w:val="1A1A2E"/>
+                <w:sz w:val="20"/>
+                <w:szCs w:val="20"/>
+              </w:rPr>
+              <w:t xml:space="preserve">High</w:t>
+            </w:r>
+          </w:p>
+        </w:tc>
+        <w:tc>
+          <w:tcPr>
+            <w:tcW w:type="dxa" w:w="2880"/>
+            <w:tcBorders>
+              <w:top w:val="single" w:color="CCCCCC" w:sz="1"/>
+              <w:left w:val="single" w:color="CCCCCC" w:sz="1"/>
+              <w:bottom w:val="single" w:color="CCCCCC" w:sz="1"/>
+              <w:right w:val="single" w:color="CCCCCC" w:sz="1"/>
+            </w:tcBorders>
+            <w:shd w:fill="F2F7FC" w:val="clear"/>
+            <w:tcMar>
+              <w:top w:type="dxa" w:w="80"/>
+              <w:left w:type="dxa" w:w="120"/>
+              <w:bottom w:type="dxa" w:w="80"/>
+              <w:right w:type="dxa" w:w="120"/>
+            </w:tcMar>
+            <w:vAlign w:val="top"/>
+          </w:tcPr>
+          <w:p>
+            <w:pPr>
+              <w:spacing w:after="40" w:before="40"/>
+            </w:pPr>
+            <w:r>
+              <w:rPr>
+                <w:rFonts w:ascii="Arial" w:cs="Arial" w:eastAsia="Arial" w:hAnsi="Arial"/>
+                <w:b w:val="false"/>
+                <w:bCs w:val="false"/>
+                <w:color w:val="1A1A2E"/>
+                <w:sz w:val="20"/>
+                <w:szCs w:val="20"/>
+              </w:rPr>
+              <w:t xml:space="preserve">Medium — popover component with MD heading parse</w:t>
+            </w:r>
+          </w:p>
+        </w:tc>
+        <w:tc>
+          <w:tcPr>
+            <w:tcW w:type="dxa" w:w="2880"/>
+            <w:tcBorders>
+              <w:top w:val="single" w:color="CCCCCC" w:sz="1"/>
+              <w:left w:val="single" w:color="CCCCCC" w:sz="1"/>
+              <w:bottom w:val="single" w:color="CCCCCC" w:sz="1"/>
+              <w:right w:val="single" w:color="CCCCCC" w:sz="1"/>
+            </w:tcBorders>
+            <w:shd w:fill="F2F7FC" w:val="clear"/>
+            <w:tcMar>
+              <w:top w:type="dxa" w:w="80"/>
+              <w:left w:type="dxa" w:w="120"/>
+              <w:bottom w:type="dxa" w:w="80"/>
+              <w:right w:type="dxa" w:w="120"/>
+            </w:tcMar>
+            <w:vAlign w:val="top"/>
+          </w:tcPr>
+          <w:p>
+            <w:pPr>
+              <w:spacing w:after="40" w:before="40"/>
+            </w:pPr>
+            <w:r>
+              <w:rPr>
+                <w:rFonts w:ascii="Arial" w:cs="Arial" w:eastAsia="Arial" w:hAnsi="Arial"/>
+                <w:b w:val="false"/>
+                <w:bCs w:val="false"/>
+                <w:color w:val="1A1A2E"/>
+                <w:sz w:val="20"/>
+                <w:szCs w:val="20"/>
+              </w:rPr>
+              <w:t xml:space="preserve">Builds trust: users see what will run before committing</w:t>
+            </w:r>
+          </w:p>
+        </w:tc>
+      </w:tr>
+      <w:tr>
+        <w:tc>
+          <w:tcPr>
+            <w:tcW w:type="dxa" w:w="2520"/>
+            <w:tcBorders>
+              <w:top w:val="single" w:color="CCCCCC" w:sz="1"/>
+              <w:left w:val="single" w:color="CCCCCC" w:sz="1"/>
+              <w:bottom w:val="single" w:color="CCCCCC" w:sz="1"/>
+              <w:right w:val="single" w:color="CCCCCC" w:sz="1"/>
+            </w:tcBorders>
+            <w:shd w:fill="FFFFFF" w:val="clear"/>
+            <w:tcMar>
+              <w:top w:type="dxa" w:w="80"/>
+              <w:left w:type="dxa" w:w="120"/>
+              <w:bottom w:type="dxa" w:w="80"/>
+              <w:right w:type="dxa" w:w="120"/>
+            </w:tcMar>
+            <w:vAlign w:val="top"/>
+          </w:tcPr>
+          <w:p>
+            <w:pPr>
+              <w:spacing w:after="40" w:before="40"/>
+            </w:pPr>
+            <w:r>
+              <w:rPr>
+                <w:rFonts w:ascii="Arial" w:cs="Arial" w:eastAsia="Arial" w:hAnsi="Arial"/>
+                <w:b w:val="false"/>
+                <w:bCs w:val="false"/>
+                <w:color w:val="1A1A2E"/>
+                <w:sz w:val="20"/>
+                <w:szCs w:val="20"/>
+              </w:rPr>
+              <w:t xml:space="preserve">9.3 Execution progress spinner in tag</w:t>
+            </w:r>
+          </w:p>
+        </w:tc>
+        <w:tc>
+          <w:tcPr>
+            <w:tcW w:type="dxa" w:w="1080"/>
+            <w:tcBorders>
+              <w:top w:val="single" w:color="CCCCCC" w:sz="1"/>
+              <w:left w:val="single" w:color="CCCCCC" w:sz="1"/>
+              <w:bottom w:val="single" w:color="CCCCCC" w:sz="1"/>
+              <w:right w:val="single" w:color="CCCCCC" w:sz="1"/>
+            </w:tcBorders>
+            <w:shd w:fill="FFFFFF" w:val="clear"/>
+            <w:tcMar>
+              <w:top w:type="dxa" w:w="80"/>
+              <w:left w:type="dxa" w:w="120"/>
+              <w:bottom w:type="dxa" w:w="80"/>
+              <w:right w:type="dxa" w:w="120"/>
+            </w:tcMar>
+            <w:vAlign w:val="top"/>
+          </w:tcPr>
+          <w:p>
+            <w:pPr>
+              <w:spacing w:after="40" w:before="40"/>
+            </w:pPr>
+            <w:r>
+              <w:rPr>
+                <w:rFonts w:ascii="Arial" w:cs="Arial" w:eastAsia="Arial" w:hAnsi="Arial"/>
+                <w:b w:val="false"/>
+                <w:bCs w:val="false"/>
+                <w:color w:val="1A1A2E"/>
+                <w:sz w:val="20"/>
+                <w:szCs w:val="20"/>
+              </w:rPr>
+              <w:t xml:space="preserve">Medium</w:t>
+            </w:r>
+          </w:p>
+        </w:tc>
+        <w:tc>
+          <w:tcPr>
+            <w:tcW w:type="dxa" w:w="2880"/>
+            <w:tcBorders>
+              <w:top w:val="single" w:color="CCCCCC" w:sz="1"/>
+              <w:left w:val="single" w:color="CCCCCC" w:sz="1"/>
+              <w:bottom w:val="single" w:color="CCCCCC" w:sz="1"/>
+              <w:right w:val="single" w:color="CCCCCC" w:sz="1"/>
+            </w:tcBorders>
+            <w:shd w:fill="FFFFFF" w:val="clear"/>
+            <w:tcMar>
+              <w:top w:type="dxa" w:w="80"/>
+              <w:left w:type="dxa" w:w="120"/>
+              <w:bottom w:type="dxa" w:w="80"/>
+              <w:right w:type="dxa" w:w="120"/>
+            </w:tcMar>
+            <w:vAlign w:val="top"/>
+          </w:tcPr>
+          <w:p>
+            <w:pPr>
+              <w:spacing w:after="40" w:before="40"/>
+            </w:pPr>
+            <w:r>
+              <w:rPr>
+                <w:rFonts w:ascii="Arial" w:cs="Arial" w:eastAsia="Arial" w:hAnsi="Arial"/>
+                <w:b w:val="false"/>
+                <w:bCs w:val="false"/>
+                <w:color w:val="1A1A2E"/>
+                <w:sz w:val="20"/>
+                <w:szCs w:val="20"/>
+              </w:rPr>
+              <w:t xml:space="preserve">Low — CSS animation + stream start/end hook</w:t>
+            </w:r>
+          </w:p>
+        </w:tc>
+        <w:tc>
+          <w:tcPr>
+            <w:tcW w:type="dxa" w:w="2880"/>
+            <w:tcBorders>
+              <w:top w:val="single" w:color="CCCCCC" w:sz="1"/>
+              <w:left w:val="single" w:color="CCCCCC" w:sz="1"/>
+              <w:bottom w:val="single" w:color="CCCCCC" w:sz="1"/>
+              <w:right w:val="single" w:color="CCCCCC" w:sz="1"/>
+            </w:tcBorders>
+            <w:shd w:fill="FFFFFF" w:val="clear"/>
+            <w:tcMar>
+              <w:top w:type="dxa" w:w="80"/>
+              <w:left w:type="dxa" w:w="120"/>
+              <w:bottom w:type="dxa" w:w="80"/>
+              <w:right w:type="dxa" w:w="120"/>
+            </w:tcMar>
+            <w:vAlign w:val="top"/>
+          </w:tcPr>
+          <w:p>
+            <w:pPr>
+              <w:spacing w:after="40" w:before="40"/>
+            </w:pPr>
+            <w:r>
+              <w:rPr>
+                <w:rFonts w:ascii="Arial" w:cs="Arial" w:eastAsia="Arial" w:hAnsi="Arial"/>
+                <w:b w:val="false"/>
+                <w:bCs w:val="false"/>
+                <w:color w:val="1A1A2E"/>
+                <w:sz w:val="20"/>
+                <w:szCs w:val="20"/>
+              </w:rPr>
+              <w:t xml:space="preserve">Confirms workflow is running, not silent</w:t>
+            </w:r>
+          </w:p>
+        </w:tc>
+      </w:tr>
+      <w:tr>
+        <w:tc>
+          <w:tcPr>
+            <w:tcW w:type="dxa" w:w="2520"/>
+            <w:tcBorders>
+              <w:top w:val="single" w:color="CCCCCC" w:sz="1"/>
+              <w:left w:val="single" w:color="CCCCCC" w:sz="1"/>
+              <w:bottom w:val="single" w:color="CCCCCC" w:sz="1"/>
+              <w:right w:val="single" w:color="CCCCCC" w:sz="1"/>
+            </w:tcBorders>
+            <w:shd w:fill="F2F7FC" w:val="clear"/>
+            <w:tcMar>
+              <w:top w:type="dxa" w:w="80"/>
+              <w:left w:type="dxa" w:w="120"/>
+              <w:bottom w:type="dxa" w:w="80"/>
+              <w:right w:type="dxa" w:w="120"/>
+            </w:tcMar>
+            <w:vAlign w:val="top"/>
+          </w:tcPr>
+          <w:p>
+            <w:pPr>
+              <w:spacing w:after="40" w:before="40"/>
+            </w:pPr>
+            <w:r>
+              <w:rPr>
+                <w:rFonts w:ascii="Arial" w:cs="Arial" w:eastAsia="Arial" w:hAnsi="Arial"/>
+                <w:b w:val="false"/>
+                <w:bCs w:val="false"/>
+                <w:color w:val="1A1A2E"/>
+                <w:sz w:val="20"/>
+                <w:szCs w:val="20"/>
+              </w:rPr>
+              <w:t xml:space="preserve">9.4 Sticky/pinned workflow context</w:t>
+            </w:r>
+          </w:p>
+        </w:tc>
+        <w:tc>
+          <w:tcPr>
+            <w:tcW w:type="dxa" w:w="1080"/>
+            <w:tcBorders>
+              <w:top w:val="single" w:color="CCCCCC" w:sz="1"/>
+              <w:left w:val="single" w:color="CCCCCC" w:sz="1"/>
+              <w:bottom w:val="single" w:color="CCCCCC" w:sz="1"/>
+              <w:right w:val="single" w:color="CCCCCC" w:sz="1"/>
+            </w:tcBorders>
+            <w:shd w:fill="F2F7FC" w:val="clear"/>
+            <w:tcMar>
+              <w:top w:type="dxa" w:w="80"/>
+              <w:left w:type="dxa" w:w="120"/>
+              <w:bottom w:type="dxa" w:w="80"/>
+              <w:right w:type="dxa" w:w="120"/>
+            </w:tcMar>
+            <w:vAlign w:val="top"/>
+          </w:tcPr>
+          <w:p>
+            <w:pPr>
+              <w:spacing w:after="40" w:before="40"/>
+            </w:pPr>
+            <w:r>
+              <w:rPr>
+                <w:rFonts w:ascii="Arial" w:cs="Arial" w:eastAsia="Arial" w:hAnsi="Arial"/>
+                <w:b w:val="false"/>
+                <w:bCs w:val="false"/>
+                <w:color w:val="1A1A2E"/>
+                <w:sz w:val="20"/>
+                <w:szCs w:val="20"/>
+              </w:rPr>
+              <w:t xml:space="preserve">Medium</w:t>
+            </w:r>
+          </w:p>
+        </w:tc>
+        <w:tc>
+          <w:tcPr>
+            <w:tcW w:type="dxa" w:w="2880"/>
+            <w:tcBorders>
+              <w:top w:val="single" w:color="CCCCCC" w:sz="1"/>
+              <w:left w:val="single" w:color="CCCCCC" w:sz="1"/>
+              <w:bottom w:val="single" w:color="CCCCCC" w:sz="1"/>
+              <w:right w:val="single" w:color="CCCCCC" w:sz="1"/>
+            </w:tcBorders>
+            <w:shd w:fill="F2F7FC" w:val="clear"/>
+            <w:tcMar>
+              <w:top w:type="dxa" w:w="80"/>
+              <w:left w:type="dxa" w:w="120"/>
+              <w:bottom w:type="dxa" w:w="80"/>
+              <w:right w:type="dxa" w:w="120"/>
+            </w:tcMar>
+            <w:vAlign w:val="top"/>
+          </w:tcPr>
+          <w:p>
+            <w:pPr>
+              <w:spacing w:after="40" w:before="40"/>
+            </w:pPr>
+            <w:r>
+              <w:rPr>
+                <w:rFonts w:ascii="Arial" w:cs="Arial" w:eastAsia="Arial" w:hAnsi="Arial"/>
+                <w:b w:val="false"/>
+                <w:bCs w:val="false"/>
+                <w:color w:val="1A1A2E"/>
+                <w:sz w:val="20"/>
+                <w:szCs w:val="20"/>
+              </w:rPr>
+              <w:t xml:space="preserve">Low — add pinned flag to panelState</w:t>
+            </w:r>
+          </w:p>
+        </w:tc>
+        <w:tc>
+          <w:tcPr>
+            <w:tcW w:type="dxa" w:w="2880"/>
+            <w:tcBorders>
+              <w:top w:val="single" w:color="CCCCCC" w:sz="1"/>
+              <w:left w:val="single" w:color="CCCCCC" w:sz="1"/>
+              <w:bottom w:val="single" w:color="CCCCCC" w:sz="1"/>
+              <w:right w:val="single" w:color="CCCCCC" w:sz="1"/>
+            </w:tcBorders>
+            <w:shd w:fill="F2F7FC" w:val="clear"/>
+            <w:tcMar>
+              <w:top w:type="dxa" w:w="80"/>
+              <w:left w:type="dxa" w:w="120"/>
+              <w:bottom w:type="dxa" w:w="80"/>
+              <w:right w:type="dxa" w:w="120"/>
+            </w:tcMar>
+            <w:vAlign w:val="top"/>
+          </w:tcPr>
+          <w:p>
+            <w:pPr>
+              <w:spacing w:after="40" w:before="40"/>
+            </w:pPr>
+            <w:r>
+              <w:rPr>
+                <w:rFonts w:ascii="Arial" w:cs="Arial" w:eastAsia="Arial" w:hAnsi="Arial"/>
+                <w:b w:val="false"/>
+                <w:bCs w:val="false"/>
+                <w:color w:val="1A1A2E"/>
+                <w:sz w:val="20"/>
+                <w:szCs w:val="20"/>
+              </w:rPr>
+              <w:t xml:space="preserve">Enables efficient multi-turn workflow sessions</w:t>
+            </w:r>
+          </w:p>
+        </w:tc>
+      </w:tr>
+      <w:tr>
+        <w:tc>
+          <w:tcPr>
+            <w:tcW w:type="dxa" w:w="2520"/>
+            <w:tcBorders>
+              <w:top w:val="single" w:color="CCCCCC" w:sz="1"/>
+              <w:left w:val="single" w:color="CCCCCC" w:sz="1"/>
+              <w:bottom w:val="single" w:color="CCCCCC" w:sz="1"/>
+              <w:right w:val="single" w:color="CCCCCC" w:sz="1"/>
+            </w:tcBorders>
+            <w:shd w:fill="FFFFFF" w:val="clear"/>
+            <w:tcMar>
+              <w:top w:type="dxa" w:w="80"/>
+              <w:left w:type="dxa" w:w="120"/>
+              <w:bottom w:type="dxa" w:w="80"/>
+              <w:right w:type="dxa" w:w="120"/>
+            </w:tcMar>
+            <w:vAlign w:val="top"/>
+          </w:tcPr>
+          <w:p>
+            <w:pPr>
+              <w:spacing w:after="40" w:before="40"/>
+            </w:pPr>
+            <w:r>
+              <w:rPr>
+                <w:rFonts w:ascii="Arial" w:cs="Arial" w:eastAsia="Arial" w:hAnsi="Arial"/>
+                <w:b w:val="false"/>
+                <w:bCs w:val="false"/>
+                <w:color w:val="1A1A2E"/>
+                <w:sz w:val="20"/>
+                <w:szCs w:val="20"/>
+              </w:rPr>
+              <w:t xml:space="preserve">9.5 Workspace search filter</w:t>
+            </w:r>
+          </w:p>
+        </w:tc>
+        <w:tc>
+          <w:tcPr>
+            <w:tcW w:type="dxa" w:w="1080"/>
+            <w:tcBorders>
+              <w:top w:val="single" w:color="CCCCCC" w:sz="1"/>
+              <w:left w:val="single" w:color="CCCCCC" w:sz="1"/>
+              <w:bottom w:val="single" w:color="CCCCCC" w:sz="1"/>
+              <w:right w:val="single" w:color="CCCCCC" w:sz="1"/>
+            </w:tcBorders>
+            <w:shd w:fill="FFFFFF" w:val="clear"/>
+            <w:tcMar>
+              <w:top w:type="dxa" w:w="80"/>
+              <w:left w:type="dxa" w:w="120"/>
+              <w:bottom w:type="dxa" w:w="80"/>
+              <w:right w:type="dxa" w:w="120"/>
+            </w:tcMar>
+            <w:vAlign w:val="top"/>
+          </w:tcPr>
+          <w:p>
+            <w:pPr>
+              <w:spacing w:after="40" w:before="40"/>
+            </w:pPr>
+            <w:r>
+              <w:rPr>
+                <w:rFonts w:ascii="Arial" w:cs="Arial" w:eastAsia="Arial" w:hAnsi="Arial"/>
+                <w:b w:val="false"/>
+                <w:bCs w:val="false"/>
+                <w:color w:val="1A1A2E"/>
+                <w:sz w:val="20"/>
+                <w:szCs w:val="20"/>
+              </w:rPr>
+              <w:t xml:space="preserve">Low</w:t>
+            </w:r>
+          </w:p>
+        </w:tc>
+        <w:tc>
+          <w:tcPr>
+            <w:tcW w:type="dxa" w:w="2880"/>
+            <w:tcBorders>
+              <w:top w:val="single" w:color="CCCCCC" w:sz="1"/>
+              <w:left w:val="single" w:color="CCCCCC" w:sz="1"/>
+              <w:bottom w:val="single" w:color="CCCCCC" w:sz="1"/>
+              <w:right w:val="single" w:color="CCCCCC" w:sz="1"/>
+            </w:tcBorders>
+            <w:shd w:fill="FFFFFF" w:val="clear"/>
+            <w:tcMar>
+              <w:top w:type="dxa" w:w="80"/>
+              <w:left w:type="dxa" w:w="120"/>
+              <w:bottom w:type="dxa" w:w="80"/>
+              <w:right w:type="dxa" w:w="120"/>
+            </w:tcMar>
+            <w:vAlign w:val="top"/>
+          </w:tcPr>
+          <w:p>
+            <w:pPr>
+              <w:spacing w:after="40" w:before="40"/>
+            </w:pPr>
+            <w:r>
+              <w:rPr>
+                <w:rFonts w:ascii="Arial" w:cs="Arial" w:eastAsia="Arial" w:hAnsi="Arial"/>
+                <w:b w:val="false"/>
+                <w:bCs w:val="false"/>
+                <w:color w:val="1A1A2E"/>
+                <w:sz w:val="20"/>
+                <w:szCs w:val="20"/>
+              </w:rPr>
+              <w:t xml:space="preserve">Low — client-side array filter</w:t>
+            </w:r>
+          </w:p>
+        </w:tc>
+        <w:tc>
+          <w:tcPr>
+            <w:tcW w:type="dxa" w:w="2880"/>
+            <w:tcBorders>
+              <w:top w:val="single" w:color="CCCCCC" w:sz="1"/>
+              <w:left w:val="single" w:color="CCCCCC" w:sz="1"/>
+              <w:bottom w:val="single" w:color="CCCCCC" w:sz="1"/>
+              <w:right w:val="single" w:color="CCCCCC" w:sz="1"/>
+            </w:tcBorders>
+            <w:shd w:fill="FFFFFF" w:val="clear"/>
+            <w:tcMar>
+              <w:top w:type="dxa" w:w="80"/>
+              <w:left w:type="dxa" w:w="120"/>
+              <w:bottom w:type="dxa" w:w="80"/>
+              <w:right w:type="dxa" w:w="120"/>
+            </w:tcMar>
+            <w:vAlign w:val="top"/>
+          </w:tcPr>
+          <w:p>
+            <w:pPr>
+              <w:spacing w:after="40" w:before="40"/>
+            </w:pPr>
+            <w:r>
+              <w:rPr>
+                <w:rFonts w:ascii="Arial" w:cs="Arial" w:eastAsia="Arial" w:hAnsi="Arial"/>
+                <w:b w:val="false"/>
+                <w:bCs w:val="false"/>
+                <w:color w:val="1A1A2E"/>
+                <w:sz w:val="20"/>
+                <w:szCs w:val="20"/>
+              </w:rPr>
+              <w:t xml:space="preserve">Quality of life for large upload folders</w:t>
+            </w:r>
+          </w:p>
+        </w:tc>
+      </w:tr>
+      <w:tr>
+        <w:tc>
+          <w:tcPr>
+            <w:tcW w:type="dxa" w:w="2520"/>
+            <w:tcBorders>
+              <w:top w:val="single" w:color="CCCCCC" w:sz="1"/>
+              <w:left w:val="single" w:color="CCCCCC" w:sz="1"/>
+              <w:bottom w:val="single" w:color="CCCCCC" w:sz="1"/>
+              <w:right w:val="single" w:color="CCCCCC" w:sz="1"/>
+            </w:tcBorders>
+            <w:shd w:fill="F2F7FC" w:val="clear"/>
+            <w:tcMar>
+              <w:top w:type="dxa" w:w="80"/>
+              <w:left w:type="dxa" w:w="120"/>
+              <w:bottom w:type="dxa" w:w="80"/>
+              <w:right w:type="dxa" w:w="120"/>
+            </w:tcMar>
+            <w:vAlign w:val="top"/>
+          </w:tcPr>
+          <w:p>
+            <w:pPr>
+              <w:spacing w:after="40" w:before="40"/>
+            </w:pPr>
+            <w:r>
+              <w:rPr>
+                <w:rFonts w:ascii="Arial" w:cs="Arial" w:eastAsia="Arial" w:hAnsi="Arial"/>
+                <w:b w:val="false"/>
+                <w:bCs w:val="false"/>
+                <w:color w:val="1A1A2E"/>
+                <w:sz w:val="20"/>
+                <w:szCs w:val="20"/>
+              </w:rPr>
+              <w:t xml:space="preserve">9.6 Auto-populated starter message</w:t>
+            </w:r>
+          </w:p>
+        </w:tc>
+        <w:tc>
+          <w:tcPr>
+            <w:tcW w:type="dxa" w:w="1080"/>
+            <w:tcBorders>
+              <w:top w:val="single" w:color="CCCCCC" w:sz="1"/>
+              <w:left w:val="single" w:color="CCCCCC" w:sz="1"/>
+              <w:bottom w:val="single" w:color="CCCCCC" w:sz="1"/>
+              <w:right w:val="single" w:color="CCCCCC" w:sz="1"/>
+            </w:tcBorders>
+            <w:shd w:fill="F2F7FC" w:val="clear"/>
+            <w:tcMar>
+              <w:top w:type="dxa" w:w="80"/>
+              <w:left w:type="dxa" w:w="120"/>
+              <w:bottom w:type="dxa" w:w="80"/>
+              <w:right w:type="dxa" w:w="120"/>
+            </w:tcMar>
+            <w:vAlign w:val="top"/>
+          </w:tcPr>
+          <w:p>
+            <w:pPr>
+              <w:spacing w:after="40" w:before="40"/>
+            </w:pPr>
+            <w:r>
+              <w:rPr>
+                <w:rFonts w:ascii="Arial" w:cs="Arial" w:eastAsia="Arial" w:hAnsi="Arial"/>
+                <w:b w:val="false"/>
+                <w:bCs w:val="false"/>
+                <w:color w:val="1A1A2E"/>
+                <w:sz w:val="20"/>
+                <w:szCs w:val="20"/>
+              </w:rPr>
+              <w:t xml:space="preserve">Low</w:t>
+            </w:r>
+          </w:p>
+        </w:tc>
+        <w:tc>
+          <w:tcPr>
+            <w:tcW w:type="dxa" w:w="2880"/>
+            <w:tcBorders>
+              <w:top w:val="single" w:color="CCCCCC" w:sz="1"/>
+              <w:left w:val="single" w:color="CCCCCC" w:sz="1"/>
+              <w:bottom w:val="single" w:color="CCCCCC" w:sz="1"/>
+              <w:right w:val="single" w:color="CCCCCC" w:sz="1"/>
+            </w:tcBorders>
+            <w:shd w:fill="F2F7FC" w:val="clear"/>
+            <w:tcMar>
+              <w:top w:type="dxa" w:w="80"/>
+              <w:left w:type="dxa" w:w="120"/>
+              <w:bottom w:type="dxa" w:w="80"/>
+              <w:right w:type="dxa" w:w="120"/>
+            </w:tcMar>
+            <w:vAlign w:val="top"/>
+          </w:tcPr>
+          <w:p>
+            <w:pPr>
+              <w:spacing w:after="40" w:before="40"/>
+            </w:pPr>
+            <w:r>
+              <w:rPr>
+                <w:rFonts w:ascii="Arial" w:cs="Arial" w:eastAsia="Arial" w:hAnsi="Arial"/>
+                <w:b w:val="false"/>
+                <w:bCs w:val="false"/>
+                <w:color w:val="1A1A2E"/>
+                <w:sz w:val="20"/>
+                <w:szCs w:val="20"/>
+              </w:rPr>
+              <w:t xml:space="preserve">Low — set input value on workflow select</w:t>
+            </w:r>
+          </w:p>
+        </w:tc>
+        <w:tc>
+          <w:tcPr>
+            <w:tcW w:type="dxa" w:w="2880"/>
+            <w:tcBorders>
+              <w:top w:val="single" w:color="CCCCCC" w:sz="1"/>
+              <w:left w:val="single" w:color="CCCCCC" w:sz="1"/>
+              <w:bottom w:val="single" w:color="CCCCCC" w:sz="1"/>
+              <w:right w:val="single" w:color="CCCCCC" w:sz="1"/>
+            </w:tcBorders>
+            <w:shd w:fill="F2F7FC" w:val="clear"/>
+            <w:tcMar>
+              <w:top w:type="dxa" w:w="80"/>
+              <w:left w:type="dxa" w:w="120"/>
+              <w:bottom w:type="dxa" w:w="80"/>
+              <w:right w:type="dxa" w:w="120"/>
+            </w:tcMar>
+            <w:vAlign w:val="top"/>
+          </w:tcPr>
+          <w:p>
+            <w:pPr>
+              <w:spacing w:after="40" w:before="40"/>
+            </w:pPr>
+            <w:r>
+              <w:rPr>
+                <w:rFonts w:ascii="Arial" w:cs="Arial" w:eastAsia="Arial" w:hAnsi="Arial"/>
+                <w:b w:val="false"/>
+                <w:bCs w:val="false"/>
+                <w:color w:val="1A1A2E"/>
+                <w:sz w:val="20"/>
+                <w:szCs w:val="20"/>
+              </w:rPr>
+              <w:t xml:space="preserve">Onboarding aid, reduces blank-input barrier</w:t>
+            </w:r>
+          </w:p>
+        </w:tc>
+      </w:tr>
+      <w:tr>
+        <w:tc>
+          <w:tcPr>
+            <w:tcW w:type="dxa" w:w="2520"/>
+            <w:tcBorders>
+              <w:top w:val="single" w:color="CCCCCC" w:sz="1"/>
+              <w:left w:val="single" w:color="CCCCCC" w:sz="1"/>
+              <w:bottom w:val="single" w:color="CCCCCC" w:sz="1"/>
+              <w:right w:val="single" w:color="CCCCCC" w:sz="1"/>
+            </w:tcBorders>
+            <w:shd w:fill="FFFFFF" w:val="clear"/>
+            <w:tcMar>
+              <w:top w:type="dxa" w:w="80"/>
+              <w:left w:type="dxa" w:w="120"/>
+              <w:bottom w:type="dxa" w:w="80"/>
+              <w:right w:type="dxa" w:w="120"/>
+            </w:tcMar>
+            <w:vAlign w:val="top"/>
+          </w:tcPr>
+          <w:p>
+            <w:pPr>
+              <w:spacing w:after="40" w:before="40"/>
+            </w:pPr>
+            <w:r>
+              <w:rPr>
+                <w:rFonts w:ascii="Arial" w:cs="Arial" w:eastAsia="Arial" w:hAnsi="Arial"/>
+                <w:b w:val="false"/>
+                <w:bCs w:val="false"/>
+                <w:color w:val="1A1A2E"/>
+                <w:sz w:val="20"/>
+                <w:szCs w:val="20"/>
+              </w:rPr>
+              <w:t xml:space="preserve">9.7 Quick-action Run button</w:t>
+            </w:r>
+          </w:p>
+        </w:tc>
+        <w:tc>
+          <w:tcPr>
+            <w:tcW w:type="dxa" w:w="1080"/>
+            <w:tcBorders>
+              <w:top w:val="single" w:color="CCCCCC" w:sz="1"/>
+              <w:left w:val="single" w:color="CCCCCC" w:sz="1"/>
+              <w:bottom w:val="single" w:color="CCCCCC" w:sz="1"/>
+              <w:right w:val="single" w:color="CCCCCC" w:sz="1"/>
+            </w:tcBorders>
+            <w:shd w:fill="FFFFFF" w:val="clear"/>
+            <w:tcMar>
+              <w:top w:type="dxa" w:w="80"/>
+              <w:left w:type="dxa" w:w="120"/>
+              <w:bottom w:type="dxa" w:w="80"/>
+              <w:right w:type="dxa" w:w="120"/>
+            </w:tcMar>
+            <w:vAlign w:val="top"/>
+          </w:tcPr>
+          <w:p>
+            <w:pPr>
+              <w:spacing w:after="40" w:before="40"/>
+            </w:pPr>
+            <w:r>
+              <w:rPr>
+                <w:rFonts w:ascii="Arial" w:cs="Arial" w:eastAsia="Arial" w:hAnsi="Arial"/>
+                <w:b w:val="false"/>
+                <w:bCs w:val="false"/>
+                <w:color w:val="1A1A2E"/>
+                <w:sz w:val="20"/>
+                <w:szCs w:val="20"/>
+              </w:rPr>
+              <w:t xml:space="preserve">Low</w:t>
+            </w:r>
+          </w:p>
+        </w:tc>
+        <w:tc>
+          <w:tcPr>
+            <w:tcW w:type="dxa" w:w="2880"/>
+            <w:tcBorders>
+              <w:top w:val="single" w:color="CCCCCC" w:sz="1"/>
+              <w:left w:val="single" w:color="CCCCCC" w:sz="1"/>
+              <w:bottom w:val="single" w:color="CCCCCC" w:sz="1"/>
+              <w:right w:val="single" w:color="CCCCCC" w:sz="1"/>
+            </w:tcBorders>
+            <w:shd w:fill="FFFFFF" w:val="clear"/>
+            <w:tcMar>
+              <w:top w:type="dxa" w:w="80"/>
+              <w:left w:type="dxa" w:w="120"/>
+              <w:bottom w:type="dxa" w:w="80"/>
+              <w:right w:type="dxa" w:w="120"/>
+            </w:tcMar>
+            <w:vAlign w:val="top"/>
+          </w:tcPr>
+          <w:p>
+            <w:pPr>
+              <w:spacing w:after="40" w:before="40"/>
+            </w:pPr>
+            <w:r>
+              <w:rPr>
+                <w:rFonts w:ascii="Arial" w:cs="Arial" w:eastAsia="Arial" w:hAnsi="Arial"/>
+                <w:b w:val="false"/>
+                <w:bCs w:val="false"/>
+                <w:color w:val="1A1A2E"/>
+                <w:sz w:val="20"/>
+                <w:szCs w:val="20"/>
+              </w:rPr>
+              <w:t xml:space="preserve">Medium — compose + send in one click</w:t>
+            </w:r>
+          </w:p>
+        </w:tc>
+        <w:tc>
+          <w:tcPr>
+            <w:tcW w:type="dxa" w:w="2880"/>
+            <w:tcBorders>
+              <w:top w:val="single" w:color="CCCCCC" w:sz="1"/>
+              <w:left w:val="single" w:color="CCCCCC" w:sz="1"/>
+              <w:bottom w:val="single" w:color="CCCCCC" w:sz="1"/>
+              <w:right w:val="single" w:color="CCCCCC" w:sz="1"/>
+            </w:tcBorders>
+            <w:shd w:fill="FFFFFF" w:val="clear"/>
+            <w:tcMar>
+              <w:top w:type="dxa" w:w="80"/>
+              <w:left w:type="dxa" w:w="120"/>
+              <w:bottom w:type="dxa" w:w="80"/>
+              <w:right w:type="dxa" w:w="120"/>
+            </w:tcMar>
+            <w:vAlign w:val="top"/>
+          </w:tcPr>
+          <w:p>
+            <w:pPr>
+              <w:spacing w:after="40" w:before="40"/>
+            </w:pPr>
+            <w:r>
+              <w:rPr>
+                <w:rFonts w:ascii="Arial" w:cs="Arial" w:eastAsia="Arial" w:hAnsi="Arial"/>
+                <w:b w:val="false"/>
+                <w:bCs w:val="false"/>
+                <w:color w:val="1A1A2E"/>
+                <w:sz w:val="20"/>
+                <w:szCs w:val="20"/>
+              </w:rPr>
+              <w:t xml:space="preserve">Power-user shortcut for parameter-free workflows</w:t>
+            </w:r>
+          </w:p>
+        </w:tc>
+      </w:tr>
+    </w:tbl>
+    <w:p>
+      <w:r>
+        <w:br w:type="page"/>
+      </w:r>
+    </w:p>
+    <w:p>
+      <w:pPr>
+        <w:pStyle w:val="Heading1"/>
+        <w:shd w:fill="1F3864" w:val="clear"/>
+        <w:spacing w:after="160" w:before="240"/>
+        <w:ind w:left="120" w:right="120"/>
+      </w:pPr>
+      <w:r>
+        <w:rPr>
+          <w:rFonts w:ascii="Arial" w:cs="Arial" w:eastAsia="Arial" w:hAnsi="Arial"/>
+          <w:b/>
+          <w:bCs/>
+          <w:color w:val="FFFFFF"/>
+          <w:sz w:val="28"/>
+          <w:szCs w:val="28"/>
+        </w:rPr>
+        <w:t xml:space="preserve">10. Acceptance Criteria</w:t>
+      </w:r>
+    </w:p>
+    <w:p>
+      <w:pPr>
+        <w:spacing w:after="80" w:before="80"/>
+      </w:pPr>
+      <w:r>
+        <w:rPr>
+          <w:rFonts w:ascii="Arial" w:cs="Arial" w:eastAsia="Arial" w:hAnsi="Arial"/>
+          <w:color w:val="1A1A2E"/>
+          <w:sz w:val="22"/>
+          <w:szCs w:val="22"/>
+        </w:rPr>
+        <w:t xml:space="preserve">AC-01 through AC-18 cover the core feature. AC-19 through AC-21 cover the high-priority UX enhancements from Section 9.</w:t>
       </w:r>
     </w:p>
     <w:tbl>
@@ -11965,6 +14863,327 @@
                 <w:szCs w:val="20"/>
               </w:rPr>
               <w:t xml:space="preserve">Section header badges reflect actual file/workflow counts and update after add/delete.</w:t>
+            </w:r>
+          </w:p>
+        </w:tc>
+      </w:tr>
+      <w:tr>
+        <w:tc>
+          <w:tcPr>
+            <w:tcW w:type="dxa" w:w="540"/>
+            <w:tcBorders>
+              <w:top w:val="single" w:color="CCCCCC" w:sz="1"/>
+              <w:left w:val="single" w:color="CCCCCC" w:sz="1"/>
+              <w:bottom w:val="single" w:color="CCCCCC" w:sz="1"/>
+              <w:right w:val="single" w:color="CCCCCC" w:sz="1"/>
+            </w:tcBorders>
+            <w:shd w:fill="FFFFFF" w:val="clear"/>
+            <w:tcMar>
+              <w:top w:type="dxa" w:w="80"/>
+              <w:left w:type="dxa" w:w="120"/>
+              <w:bottom w:type="dxa" w:w="80"/>
+              <w:right w:type="dxa" w:w="120"/>
+            </w:tcMar>
+            <w:vAlign w:val="top"/>
+          </w:tcPr>
+          <w:p>
+            <w:pPr>
+              <w:spacing w:after="40" w:before="40"/>
+            </w:pPr>
+            <w:r>
+              <w:rPr>
+                <w:rFonts w:ascii="Arial" w:cs="Arial" w:eastAsia="Arial" w:hAnsi="Arial"/>
+                <w:b w:val="false"/>
+                <w:bCs w:val="false"/>
+                <w:color w:val="1A1A2E"/>
+                <w:sz w:val="20"/>
+                <w:szCs w:val="20"/>
+              </w:rPr>
+              <w:t xml:space="preserve">AC-19</w:t>
+            </w:r>
+          </w:p>
+        </w:tc>
+        <w:tc>
+          <w:tcPr>
+            <w:tcW w:type="dxa" w:w="3240"/>
+            <w:tcBorders>
+              <w:top w:val="single" w:color="CCCCCC" w:sz="1"/>
+              <w:left w:val="single" w:color="CCCCCC" w:sz="1"/>
+              <w:bottom w:val="single" w:color="CCCCCC" w:sz="1"/>
+              <w:right w:val="single" w:color="CCCCCC" w:sz="1"/>
+            </w:tcBorders>
+            <w:shd w:fill="FFFFFF" w:val="clear"/>
+            <w:tcMar>
+              <w:top w:type="dxa" w:w="80"/>
+              <w:left w:type="dxa" w:w="120"/>
+              <w:bottom w:type="dxa" w:w="80"/>
+              <w:right w:type="dxa" w:w="120"/>
+            </w:tcMar>
+            <w:vAlign w:val="top"/>
+          </w:tcPr>
+          <w:p>
+            <w:pPr>
+              <w:spacing w:after="40" w:before="40"/>
+            </w:pPr>
+            <w:r>
+              <w:rPr>
+                <w:rFonts w:ascii="Arial" w:cs="Arial" w:eastAsia="Arial" w:hAnsi="Arial"/>
+                <w:b w:val="false"/>
+                <w:bCs w:val="false"/>
+                <w:color w:val="1A1A2E"/>
+                <w:sz w:val="20"/>
+                <w:szCs w:val="20"/>
+              </w:rPr>
+              <w:t xml:space="preserve">Prompt composition with runtime example</w:t>
+            </w:r>
+          </w:p>
+        </w:tc>
+        <w:tc>
+          <w:tcPr>
+            <w:tcW w:type="dxa" w:w="5580"/>
+            <w:tcBorders>
+              <w:top w:val="single" w:color="CCCCCC" w:sz="1"/>
+              <w:left w:val="single" w:color="CCCCCC" w:sz="1"/>
+              <w:bottom w:val="single" w:color="CCCCCC" w:sz="1"/>
+              <w:right w:val="single" w:color="CCCCCC" w:sz="1"/>
+            </w:tcBorders>
+            <w:shd w:fill="FFFFFF" w:val="clear"/>
+            <w:tcMar>
+              <w:top w:type="dxa" w:w="80"/>
+              <w:left w:type="dxa" w:w="120"/>
+              <w:bottom w:type="dxa" w:w="80"/>
+              <w:right w:type="dxa" w:w="120"/>
+            </w:tcMar>
+            <w:vAlign w:val="top"/>
+          </w:tcPr>
+          <w:p>
+            <w:pPr>
+              <w:spacing w:after="40" w:before="40"/>
+            </w:pPr>
+            <w:r>
+              <w:rPr>
+                <w:rFonts w:ascii="Arial" w:cs="Arial" w:eastAsia="Arial" w:hAnsi="Arial"/>
+                <w:b w:val="false"/>
+                <w:bCs w:val="false"/>
+                <w:color w:val="1A1A2E"/>
+                <w:sz w:val="20"/>
+                <w:szCs w:val="20"/>
+              </w:rPr>
+              <w:t xml:space="preserve">Selecting "CCR Analysis" workflow + "Q1_exposure.pdf" doc + sending "run CCR analysis on Q1 report" produces a composed message starting with [Workflow: CCR Analysis] followed by full MD content, then [Context Documents: Q1_exposure.pdf], then the user text — verified by logging composeMessage() output.</w:t>
+            </w:r>
+          </w:p>
+        </w:tc>
+      </w:tr>
+      <w:tr>
+        <w:tc>
+          <w:tcPr>
+            <w:tcW w:type="dxa" w:w="540"/>
+            <w:tcBorders>
+              <w:top w:val="single" w:color="CCCCCC" w:sz="1"/>
+              <w:left w:val="single" w:color="CCCCCC" w:sz="1"/>
+              <w:bottom w:val="single" w:color="CCCCCC" w:sz="1"/>
+              <w:right w:val="single" w:color="CCCCCC" w:sz="1"/>
+            </w:tcBorders>
+            <w:shd w:fill="F2F7FC" w:val="clear"/>
+            <w:tcMar>
+              <w:top w:type="dxa" w:w="80"/>
+              <w:left w:type="dxa" w:w="120"/>
+              <w:bottom w:type="dxa" w:w="80"/>
+              <w:right w:type="dxa" w:w="120"/>
+            </w:tcMar>
+            <w:vAlign w:val="top"/>
+          </w:tcPr>
+          <w:p>
+            <w:pPr>
+              <w:spacing w:after="40" w:before="40"/>
+            </w:pPr>
+            <w:r>
+              <w:rPr>
+                <w:rFonts w:ascii="Arial" w:cs="Arial" w:eastAsia="Arial" w:hAnsi="Arial"/>
+                <w:b w:val="false"/>
+                <w:bCs w:val="false"/>
+                <w:color w:val="1A1A2E"/>
+                <w:sz w:val="20"/>
+                <w:szCs w:val="20"/>
+              </w:rPr>
+              <w:t xml:space="preserve">AC-20</w:t>
+            </w:r>
+          </w:p>
+        </w:tc>
+        <w:tc>
+          <w:tcPr>
+            <w:tcW w:type="dxa" w:w="3240"/>
+            <w:tcBorders>
+              <w:top w:val="single" w:color="CCCCCC" w:sz="1"/>
+              <w:left w:val="single" w:color="CCCCCC" w:sz="1"/>
+              <w:bottom w:val="single" w:color="CCCCCC" w:sz="1"/>
+              <w:right w:val="single" w:color="CCCCCC" w:sz="1"/>
+            </w:tcBorders>
+            <w:shd w:fill="F2F7FC" w:val="clear"/>
+            <w:tcMar>
+              <w:top w:type="dxa" w:w="80"/>
+              <w:left w:type="dxa" w:w="120"/>
+              <w:bottom w:type="dxa" w:w="80"/>
+              <w:right w:type="dxa" w:w="120"/>
+            </w:tcMar>
+            <w:vAlign w:val="top"/>
+          </w:tcPr>
+          <w:p>
+            <w:pPr>
+              <w:spacing w:after="40" w:before="40"/>
+            </w:pPr>
+            <w:r>
+              <w:rPr>
+                <w:rFonts w:ascii="Arial" w:cs="Arial" w:eastAsia="Arial" w:hAnsi="Arial"/>
+                <w:b w:val="false"/>
+                <w:bCs w:val="false"/>
+                <w:color w:val="1A1A2E"/>
+                <w:sz w:val="20"/>
+                <w:szCs w:val="20"/>
+              </w:rPr>
+              <w:t xml:space="preserve">Input hints from MD</w:t>
+            </w:r>
+          </w:p>
+        </w:tc>
+        <w:tc>
+          <w:tcPr>
+            <w:tcW w:type="dxa" w:w="5580"/>
+            <w:tcBorders>
+              <w:top w:val="single" w:color="CCCCCC" w:sz="1"/>
+              <w:left w:val="single" w:color="CCCCCC" w:sz="1"/>
+              <w:bottom w:val="single" w:color="CCCCCC" w:sz="1"/>
+              <w:right w:val="single" w:color="CCCCCC" w:sz="1"/>
+            </w:tcBorders>
+            <w:shd w:fill="F2F7FC" w:val="clear"/>
+            <w:tcMar>
+              <w:top w:type="dxa" w:w="80"/>
+              <w:left w:type="dxa" w:w="120"/>
+              <w:bottom w:type="dxa" w:w="80"/>
+              <w:right w:type="dxa" w:w="120"/>
+            </w:tcMar>
+            <w:vAlign w:val="top"/>
+          </w:tcPr>
+          <w:p>
+            <w:pPr>
+              <w:spacing w:after="40" w:before="40"/>
+            </w:pPr>
+            <w:r>
+              <w:rPr>
+                <w:rFonts w:ascii="Arial" w:cs="Arial" w:eastAsia="Arial" w:hAnsi="Arial"/>
+                <w:b w:val="false"/>
+                <w:bCs w:val="false"/>
+                <w:color w:val="1A1A2E"/>
+                <w:sz w:val="20"/>
+                <w:szCs w:val="20"/>
+              </w:rPr>
+              <w:t xml:space="preserve">If counterparty_intelligence.md contains a ## Inputs: section, the chat input placeholder updates to reflect those inputs when the workflow is selected.</w:t>
+            </w:r>
+          </w:p>
+        </w:tc>
+      </w:tr>
+      <w:tr>
+        <w:tc>
+          <w:tcPr>
+            <w:tcW w:type="dxa" w:w="540"/>
+            <w:tcBorders>
+              <w:top w:val="single" w:color="CCCCCC" w:sz="1"/>
+              <w:left w:val="single" w:color="CCCCCC" w:sz="1"/>
+              <w:bottom w:val="single" w:color="CCCCCC" w:sz="1"/>
+              <w:right w:val="single" w:color="CCCCCC" w:sz="1"/>
+            </w:tcBorders>
+            <w:shd w:fill="FFFFFF" w:val="clear"/>
+            <w:tcMar>
+              <w:top w:type="dxa" w:w="80"/>
+              <w:left w:type="dxa" w:w="120"/>
+              <w:bottom w:type="dxa" w:w="80"/>
+              <w:right w:type="dxa" w:w="120"/>
+            </w:tcMar>
+            <w:vAlign w:val="top"/>
+          </w:tcPr>
+          <w:p>
+            <w:pPr>
+              <w:spacing w:after="40" w:before="40"/>
+            </w:pPr>
+            <w:r>
+              <w:rPr>
+                <w:rFonts w:ascii="Arial" w:cs="Arial" w:eastAsia="Arial" w:hAnsi="Arial"/>
+                <w:b w:val="false"/>
+                <w:bCs w:val="false"/>
+                <w:color w:val="1A1A2E"/>
+                <w:sz w:val="20"/>
+                <w:szCs w:val="20"/>
+              </w:rPr>
+              <w:t xml:space="preserve">AC-21</w:t>
+            </w:r>
+          </w:p>
+        </w:tc>
+        <w:tc>
+          <w:tcPr>
+            <w:tcW w:type="dxa" w:w="3240"/>
+            <w:tcBorders>
+              <w:top w:val="single" w:color="CCCCCC" w:sz="1"/>
+              <w:left w:val="single" w:color="CCCCCC" w:sz="1"/>
+              <w:bottom w:val="single" w:color="CCCCCC" w:sz="1"/>
+              <w:right w:val="single" w:color="CCCCCC" w:sz="1"/>
+            </w:tcBorders>
+            <w:shd w:fill="FFFFFF" w:val="clear"/>
+            <w:tcMar>
+              <w:top w:type="dxa" w:w="80"/>
+              <w:left w:type="dxa" w:w="120"/>
+              <w:bottom w:type="dxa" w:w="80"/>
+              <w:right w:type="dxa" w:w="120"/>
+            </w:tcMar>
+            <w:vAlign w:val="top"/>
+          </w:tcPr>
+          <w:p>
+            <w:pPr>
+              <w:spacing w:after="40" w:before="40"/>
+            </w:pPr>
+            <w:r>
+              <w:rPr>
+                <w:rFonts w:ascii="Arial" w:cs="Arial" w:eastAsia="Arial" w:hAnsi="Arial"/>
+                <w:b w:val="false"/>
+                <w:bCs w:val="false"/>
+                <w:color w:val="1A1A2E"/>
+                <w:sz w:val="20"/>
+                <w:szCs w:val="20"/>
+              </w:rPr>
+              <w:t xml:space="preserve">Sticky workflow context</w:t>
+            </w:r>
+          </w:p>
+        </w:tc>
+        <w:tc>
+          <w:tcPr>
+            <w:tcW w:type="dxa" w:w="5580"/>
+            <w:tcBorders>
+              <w:top w:val="single" w:color="CCCCCC" w:sz="1"/>
+              <w:left w:val="single" w:color="CCCCCC" w:sz="1"/>
+              <w:bottom w:val="single" w:color="CCCCCC" w:sz="1"/>
+              <w:right w:val="single" w:color="CCCCCC" w:sz="1"/>
+            </w:tcBorders>
+            <w:shd w:fill="FFFFFF" w:val="clear"/>
+            <w:tcMar>
+              <w:top w:type="dxa" w:w="80"/>
+              <w:left w:type="dxa" w:w="120"/>
+              <w:bottom w:type="dxa" w:w="80"/>
+              <w:right w:type="dxa" w:w="120"/>
+            </w:tcMar>
+            <w:vAlign w:val="top"/>
+          </w:tcPr>
+          <w:p>
+            <w:pPr>
+              <w:spacing w:after="40" w:before="40"/>
+            </w:pPr>
+            <w:r>
+              <w:rPr>
+                <w:rFonts w:ascii="Arial" w:cs="Arial" w:eastAsia="Arial" w:hAnsi="Arial"/>
+                <w:b w:val="false"/>
+                <w:bCs w:val="false"/>
+                <w:color w:val="1A1A2E"/>
+                <w:sz w:val="20"/>
+                <w:szCs w:val="20"/>
+              </w:rPr>
+              <w:t xml:space="preserve">Pinning a workflow via the 📌 icon keeps it in the context bar after send. Unpinning removes it on next send.</w:t>
             </w:r>
           </w:p>
         </w:tc>

</xml_diff>